<commit_message>
feat(portaria-web): adiciona banner de rede offline e traduz erros tecnicos para o porteiro
</commit_message>
<xml_diff>
--- a/comercial/Contrato_Prestare_Veredas_do_Sol.docx
+++ b/comercial/Contrato_Prestare_Veredas_do_Sol.docx
@@ -38,7 +38,7 @@
     </w:p>
     <w:p>
       <w:pPr>
-        <w:spacing w:after="260"/>
+        <w:spacing w:after="200"/>
         <w:jc w:val="center"/>
       </w:pPr>
       <w:r>
@@ -55,7 +55,7 @@
     </w:p>
     <w:p>
       <w:pPr>
-        <w:spacing w:after="110" w:line="276"/>
+        <w:spacing w:after="96" w:line="272"/>
         <w:jc w:val="both"/>
       </w:pPr>
       <w:r>
@@ -79,7 +79,7 @@
     </w:p>
     <w:p>
       <w:pPr>
-        <w:spacing w:after="110" w:line="276"/>
+        <w:spacing w:after="96" w:line="272"/>
         <w:jc w:val="both"/>
       </w:pPr>
       <w:r>
@@ -139,22 +139,22 @@
     </w:p>
     <w:p>
       <w:pPr>
-        <w:spacing w:after="110" w:line="276"/>
-        <w:jc w:val="both"/>
-      </w:pPr>
-      <w:r>
-        <w:rPr>
-          <w:rFonts w:ascii="Calibri" w:cs="Calibri" w:eastAsia="Calibri" w:hAnsi="Calibri"/>
-          <w:sz w:val="22"/>
-          <w:szCs w:val="22"/>
-        </w:rPr>
-        <w:t xml:space="preserve">As partes têm entre si, justo e contratado, o presente instrumento, que se regerá pelas cláusulas seguintes e pela legislação aplicável.</w:t>
+        <w:spacing w:after="96" w:line="272"/>
+        <w:jc w:val="both"/>
+      </w:pPr>
+      <w:r>
+        <w:rPr>
+          <w:rFonts w:ascii="Calibri" w:cs="Calibri" w:eastAsia="Calibri" w:hAnsi="Calibri"/>
+          <w:sz w:val="22"/>
+          <w:szCs w:val="22"/>
+        </w:rPr>
+        <w:t xml:space="preserve">As partes têm entre si, justo e contratado, o presente instrumento, que se regerá pelas cláusulas seguintes, pelo Anexo I e pelo Anexo II, que dele fazem parte integrante, e pela legislação aplicável.</w:t>
       </w:r>
     </w:p>
     <w:p>
       <w:pPr>
         <w:keepNext/>
-        <w:spacing w:after="110" w:before="240" w:line="276"/>
+        <w:spacing w:after="96" w:before="215" w:line="272"/>
       </w:pPr>
       <w:r>
         <w:rPr>
@@ -170,7 +170,7 @@
     </w:p>
     <w:p>
       <w:pPr>
-        <w:spacing w:after="100" w:line="276"/>
+        <w:spacing w:after="88" w:line="272"/>
         <w:ind w:left="300"/>
         <w:jc w:val="both"/>
       </w:pPr>
@@ -185,7 +185,7 @@
     </w:p>
     <w:p>
       <w:pPr>
-        <w:spacing w:after="100" w:line="276"/>
+        <w:spacing w:after="88" w:line="272"/>
         <w:ind w:left="300"/>
         <w:jc w:val="both"/>
       </w:pPr>
@@ -236,7 +236,7 @@
     </w:p>
     <w:p>
       <w:pPr>
-        <w:spacing w:after="100" w:line="276"/>
+        <w:spacing w:after="88" w:line="272"/>
         <w:ind w:left="300"/>
         <w:jc w:val="both"/>
       </w:pPr>
@@ -251,7 +251,7 @@
     </w:p>
     <w:p>
       <w:pPr>
-        <w:spacing w:after="100" w:line="276"/>
+        <w:spacing w:after="88" w:line="272"/>
         <w:ind w:left="300"/>
         <w:jc w:val="both"/>
       </w:pPr>
@@ -271,20 +271,56 @@
           <w:sz w:val="22"/>
           <w:szCs w:val="22"/>
         </w:rPr>
-        <w:t xml:space="preserve">Anexo I e evolução do sistema.</w:t>
-      </w:r>
-      <w:r>
-        <w:rPr>
-          <w:rFonts w:ascii="Calibri" w:cs="Calibri" w:eastAsia="Calibri" w:hAnsi="Calibri"/>
-          <w:sz w:val="22"/>
-          <w:szCs w:val="22"/>
-        </w:rPr>
-        <w:t xml:space="preserve"> A descrição funcional dos módulos consta do "Guia de Áreas do Aplicativo", que integra este contrato como Anexo I, rubricado pelas partes. Telas, fluxos e funcionalidades poderão ser atualizados ou substituídos por outros de função equivalente, sem que isso configure descumprimento contratual, desde que preservadas as funções essenciais do item 1.1; atualizações e correções não têm custo adicional, e módulos comercializados à parte dependem de contratação específica.</w:t>
-      </w:r>
-    </w:p>
-    <w:p>
-      <w:pPr>
-        <w:spacing w:after="100" w:line="276"/>
+        <w:t xml:space="preserve">Anexos e evolução do sistema.</w:t>
+      </w:r>
+      <w:r>
+        <w:rPr>
+          <w:rFonts w:ascii="Calibri" w:cs="Calibri" w:eastAsia="Calibri" w:hAnsi="Calibri"/>
+          <w:sz w:val="22"/>
+          <w:szCs w:val="22"/>
+        </w:rPr>
+        <w:t xml:space="preserve"> A descrição funcional dos módulos consta do "Guia de Áreas do Aplicativo" (</w:t>
+      </w:r>
+      <w:r>
+        <w:rPr>
+          <w:rFonts w:ascii="Calibri" w:cs="Calibri" w:eastAsia="Calibri" w:hAnsi="Calibri"/>
+          <w:b/>
+          <w:bCs/>
+          <w:sz w:val="22"/>
+          <w:szCs w:val="22"/>
+        </w:rPr>
+        <w:t xml:space="preserve">Anexo I</w:t>
+      </w:r>
+      <w:r>
+        <w:rPr>
+          <w:rFonts w:ascii="Calibri" w:cs="Calibri" w:eastAsia="Calibri" w:hAnsi="Calibri"/>
+          <w:sz w:val="22"/>
+          <w:szCs w:val="22"/>
+        </w:rPr>
+        <w:t xml:space="preserve">) e o detalhamento operacional, técnico e de proteção de dados consta do </w:t>
+      </w:r>
+      <w:r>
+        <w:rPr>
+          <w:rFonts w:ascii="Calibri" w:cs="Calibri" w:eastAsia="Calibri" w:hAnsi="Calibri"/>
+          <w:b/>
+          <w:bCs/>
+          <w:sz w:val="22"/>
+          <w:szCs w:val="22"/>
+        </w:rPr>
+        <w:t xml:space="preserve">Anexo II</w:t>
+      </w:r>
+      <w:r>
+        <w:rPr>
+          <w:rFonts w:ascii="Calibri" w:cs="Calibri" w:eastAsia="Calibri" w:hAnsi="Calibri"/>
+          <w:sz w:val="22"/>
+          <w:szCs w:val="22"/>
+        </w:rPr>
+        <w:t xml:space="preserve">, ambos rubricados pelas partes e integrantes deste contrato. Telas, fluxos e funcionalidades poderão ser atualizados ou substituídos por outros de função equivalente, sem que isso configure descumprimento contratual, desde que preservadas as funções essenciais do item 1.1; atualizações e correções não têm custo adicional, e módulos comercializados à parte dependem de contratação específica.</w:t>
+      </w:r>
+    </w:p>
+    <w:p>
+      <w:pPr>
+        <w:spacing w:after="88" w:line="272"/>
         <w:ind w:left="300"/>
         <w:jc w:val="both"/>
       </w:pPr>
@@ -335,7 +371,7 @@
     </w:p>
     <w:p>
       <w:pPr>
-        <w:spacing w:after="100" w:line="276"/>
+        <w:spacing w:after="88" w:line="272"/>
         <w:ind w:left="300"/>
         <w:jc w:val="both"/>
       </w:pPr>
@@ -363,13 +399,13 @@
           <w:sz w:val="22"/>
           <w:szCs w:val="22"/>
         </w:rPr>
-        <w:t xml:space="preserve"> Os dados inseridos no sistema — cadastros, registros de acesso, encomendas, ocorrências e lançamentos financeiros — são de titularidade da CONTRATANTE, que poderá exportá-los a qualquer tempo pelos recursos do próprio sistema e na forma do item 7.8.</w:t>
+        <w:t xml:space="preserve"> Os dados inseridos no sistema — cadastros, registros de acesso, encomendas, ocorrências e lançamentos financeiros — são de titularidade da CONTRATANTE, que poderá exportá-los a qualquer tempo pelos recursos do próprio sistema e na forma do item 7.8 e do Anexo II.</w:t>
       </w:r>
     </w:p>
     <w:p>
       <w:pPr>
         <w:keepNext/>
-        <w:spacing w:after="110" w:before="240" w:line="276"/>
+        <w:spacing w:after="96" w:before="215" w:line="272"/>
       </w:pPr>
       <w:r>
         <w:rPr>
@@ -385,7 +421,7 @@
     </w:p>
     <w:p>
       <w:pPr>
-        <w:spacing w:after="100" w:line="276"/>
+        <w:spacing w:after="88" w:line="272"/>
         <w:ind w:left="300"/>
         <w:jc w:val="both"/>
       </w:pPr>
@@ -400,7 +436,7 @@
     </w:p>
     <w:p>
       <w:pPr>
-        <w:spacing w:after="100" w:line="276"/>
+        <w:spacing w:after="88" w:line="272"/>
         <w:ind w:left="300"/>
         <w:jc w:val="both"/>
       </w:pPr>
@@ -416,7 +452,7 @@
     <w:p>
       <w:pPr>
         <w:keepNext/>
-        <w:spacing w:after="110" w:before="240" w:line="276"/>
+        <w:spacing w:after="96" w:before="215" w:line="272"/>
       </w:pPr>
       <w:r>
         <w:rPr>
@@ -432,7 +468,7 @@
     </w:p>
     <w:p>
       <w:pPr>
-        <w:spacing w:after="100" w:line="276"/>
+        <w:spacing w:after="88" w:line="272"/>
         <w:ind w:left="300"/>
         <w:jc w:val="both"/>
       </w:pPr>
@@ -483,7 +519,7 @@
     </w:p>
     <w:p>
       <w:pPr>
-        <w:spacing w:after="100" w:line="276"/>
+        <w:spacing w:after="88" w:line="272"/>
         <w:ind w:left="300"/>
         <w:jc w:val="both"/>
       </w:pPr>
@@ -570,7 +606,7 @@
     </w:p>
     <w:p>
       <w:pPr>
-        <w:spacing w:after="100" w:line="276"/>
+        <w:spacing w:after="88" w:line="272"/>
         <w:ind w:left="300"/>
         <w:jc w:val="both"/>
       </w:pPr>
@@ -603,7 +639,7 @@
     </w:p>
     <w:p>
       <w:pPr>
-        <w:spacing w:after="100" w:line="276"/>
+        <w:spacing w:after="88" w:line="272"/>
         <w:ind w:left="300"/>
         <w:jc w:val="both"/>
       </w:pPr>
@@ -636,7 +672,7 @@
     </w:p>
     <w:p>
       <w:pPr>
-        <w:spacing w:after="100" w:line="276"/>
+        <w:spacing w:after="88" w:line="272"/>
         <w:ind w:left="300"/>
         <w:jc w:val="both"/>
       </w:pPr>
@@ -656,15 +692,33 @@
           <w:sz w:val="22"/>
           <w:szCs w:val="22"/>
         </w:rPr>
-        <w:t xml:space="preserve">Inadimplência.</w:t>
-      </w:r>
-      <w:r>
-        <w:rPr>
-          <w:rFonts w:ascii="Calibri" w:cs="Calibri" w:eastAsia="Calibri" w:hAnsi="Calibri"/>
-          <w:sz w:val="22"/>
-          <w:szCs w:val="22"/>
-        </w:rPr>
-        <w:t xml:space="preserve"> O atraso superior a 30 (trinta) dias enseja notificação escrita com prazo de 10 (dez) dias para regularização; não regularizado o pagamento, a CONTRATADA poderá suspender o acesso ao sistema até a quitação, comunicando previamente a CONTRATANTE para que adote os procedimentos manuais de portaria que entender necessários; o atraso superior a 60 (sessenta) dias faculta a rescisão por justa causa, independentemente de nova notificação e sem prejuízo da cobrança dos valores em aberto. Este regime </w:t>
+        <w:t xml:space="preserve">Inadimplência e suspensão.</w:t>
+      </w:r>
+      <w:r>
+        <w:rPr>
+          <w:rFonts w:ascii="Calibri" w:cs="Calibri" w:eastAsia="Calibri" w:hAnsi="Calibri"/>
+          <w:sz w:val="22"/>
+          <w:szCs w:val="22"/>
+        </w:rPr>
+        <w:t xml:space="preserve"> O atraso superior a 30 (trinta) dias enseja notificação escrita com prazo de 10 (dez) dias para regularização; persistindo o inadimplemento, a CONTRATADA enviará </w:t>
+      </w:r>
+      <w:r>
+        <w:rPr>
+          <w:rFonts w:ascii="Calibri" w:cs="Calibri" w:eastAsia="Calibri" w:hAnsi="Calibri"/>
+          <w:b/>
+          <w:bCs/>
+          <w:sz w:val="22"/>
+          <w:szCs w:val="22"/>
+        </w:rPr>
+        <w:t xml:space="preserve">aviso final com 5 (cinco) dias de antecedência</w:t>
+      </w:r>
+      <w:r>
+        <w:rPr>
+          <w:rFonts w:ascii="Calibri" w:cs="Calibri" w:eastAsia="Calibri" w:hAnsi="Calibri"/>
+          <w:sz w:val="22"/>
+          <w:szCs w:val="22"/>
+        </w:rPr>
+        <w:t xml:space="preserve"> e poderá então suspender o acesso ao sistema até a quitação, cabendo à CONTRATANTE adotar os procedimentos manuais de portaria que entender necessários. O atraso superior a 60 (sessenta) dias faculta a rescisão por justa causa, sem prejuízo da cobrança dos valores em aberto. Este regime </w:t>
       </w:r>
       <w:r>
         <w:rPr>
@@ -682,12 +736,81 @@
           <w:sz w:val="22"/>
           <w:szCs w:val="22"/>
         </w:rPr>
-        <w:t xml:space="preserve">. A suspensão não implica perda dos dados registrados, que serão restabelecidos com a regularização.</w:t>
-      </w:r>
-    </w:p>
-    <w:p>
-      <w:pPr>
-        <w:spacing w:after="100" w:line="276"/>
+        <w:t xml:space="preserve">.</w:t>
+      </w:r>
+    </w:p>
+    <w:p>
+      <w:pPr>
+        <w:spacing w:after="88" w:line="272"/>
+        <w:ind w:left="300"/>
+        <w:jc w:val="both"/>
+      </w:pPr>
+      <w:r>
+        <w:rPr>
+          <w:rFonts w:ascii="Calibri" w:cs="Calibri" w:eastAsia="Calibri" w:hAnsi="Calibri"/>
+          <w:sz w:val="22"/>
+          <w:szCs w:val="22"/>
+        </w:rPr>
+        <w:t xml:space="preserve">3.5.1. </w:t>
+      </w:r>
+      <w:r>
+        <w:rPr>
+          <w:rFonts w:ascii="Calibri" w:cs="Calibri" w:eastAsia="Calibri" w:hAnsi="Calibri"/>
+          <w:b/>
+          <w:bCs/>
+          <w:sz w:val="22"/>
+          <w:szCs w:val="22"/>
+        </w:rPr>
+        <w:t xml:space="preserve">Limites da suspensão.</w:t>
+      </w:r>
+      <w:r>
+        <w:rPr>
+          <w:rFonts w:ascii="Calibri" w:cs="Calibri" w:eastAsia="Calibri" w:hAnsi="Calibri"/>
+          <w:sz w:val="22"/>
+          <w:szCs w:val="22"/>
+        </w:rPr>
+        <w:t xml:space="preserve"> Durante a suspensão permanecem disponíveis à CONTRATANTE a </w:t>
+      </w:r>
+      <w:r>
+        <w:rPr>
+          <w:rFonts w:ascii="Calibri" w:cs="Calibri" w:eastAsia="Calibri" w:hAnsi="Calibri"/>
+          <w:b/>
+          <w:bCs/>
+          <w:sz w:val="22"/>
+          <w:szCs w:val="22"/>
+        </w:rPr>
+        <w:t xml:space="preserve">consulta e a exportação de seus dados</w:t>
+      </w:r>
+      <w:r>
+        <w:rPr>
+          <w:rFonts w:ascii="Calibri" w:cs="Calibri" w:eastAsia="Calibri" w:hAnsi="Calibri"/>
+          <w:sz w:val="22"/>
+          <w:szCs w:val="22"/>
+        </w:rPr>
+        <w:t xml:space="preserve">, na forma do item 7.8; a suspensão </w:t>
+      </w:r>
+      <w:r>
+        <w:rPr>
+          <w:rFonts w:ascii="Calibri" w:cs="Calibri" w:eastAsia="Calibri" w:hAnsi="Calibri"/>
+          <w:b/>
+          <w:bCs/>
+          <w:sz w:val="22"/>
+          <w:szCs w:val="22"/>
+        </w:rPr>
+        <w:t xml:space="preserve">não será aplicada</w:t>
+      </w:r>
+      <w:r>
+        <w:rPr>
+          <w:rFonts w:ascii="Calibri" w:cs="Calibri" w:eastAsia="Calibri" w:hAnsi="Calibri"/>
+          <w:sz w:val="22"/>
+          <w:szCs w:val="22"/>
+        </w:rPr>
+        <w:t xml:space="preserve"> enquanto pendente de análise contestação formal de cobrança apresentada pela CONTRATANTE, nem durante incidente de segurança em curso; e a reativação ocorrerá em até 1 (um) dia útil da confirmação do pagamento. A suspensão não implica perda dos dados registrados.</w:t>
+      </w:r>
+    </w:p>
+    <w:p>
+      <w:pPr>
+        <w:spacing w:after="88" w:line="272"/>
         <w:ind w:left="300"/>
         <w:jc w:val="both"/>
       </w:pPr>
@@ -731,7 +854,7 @@
     <w:p>
       <w:pPr>
         <w:keepNext/>
-        <w:spacing w:after="110" w:before="240" w:line="276"/>
+        <w:spacing w:after="96" w:before="215" w:line="272"/>
       </w:pPr>
       <w:r>
         <w:rPr>
@@ -747,22 +870,40 @@
     </w:p>
     <w:p>
       <w:pPr>
-        <w:spacing w:after="100" w:line="276"/>
-        <w:ind w:left="300"/>
-        <w:jc w:val="both"/>
-      </w:pPr>
-      <w:r>
-        <w:rPr>
-          <w:rFonts w:ascii="Calibri" w:cs="Calibri" w:eastAsia="Calibri" w:hAnsi="Calibri"/>
-          <w:sz w:val="22"/>
-          <w:szCs w:val="22"/>
-        </w:rPr>
-        <w:t xml:space="preserve">4.1. A CONTRATADA empregará seus melhores esforços para manter o sistema disponível 24 (vinte e quatro) horas por dia, com meta de disponibilidade mensal de 99% (noventa e nove por cento), apurada mensalmente e excluídas do cálculo as hipóteses do item 4.2.</w:t>
-      </w:r>
-    </w:p>
-    <w:p>
-      <w:pPr>
-        <w:spacing w:after="100" w:line="276"/>
+        <w:spacing w:after="88" w:line="272"/>
+        <w:ind w:left="300"/>
+        <w:jc w:val="both"/>
+      </w:pPr>
+      <w:r>
+        <w:rPr>
+          <w:rFonts w:ascii="Calibri" w:cs="Calibri" w:eastAsia="Calibri" w:hAnsi="Calibri"/>
+          <w:sz w:val="22"/>
+          <w:szCs w:val="22"/>
+        </w:rPr>
+        <w:t xml:space="preserve">4.1. A CONTRATADA empregará seus melhores esforços para manter o sistema disponível 24 (vinte e quatro) horas por dia, com </w:t>
+      </w:r>
+      <w:r>
+        <w:rPr>
+          <w:rFonts w:ascii="Calibri" w:cs="Calibri" w:eastAsia="Calibri" w:hAnsi="Calibri"/>
+          <w:b/>
+          <w:bCs/>
+          <w:sz w:val="22"/>
+          <w:szCs w:val="22"/>
+        </w:rPr>
+        <w:t xml:space="preserve">meta de disponibilidade mensal de 99% (noventa e nove por cento)</w:t>
+      </w:r>
+      <w:r>
+        <w:rPr>
+          <w:rFonts w:ascii="Calibri" w:cs="Calibri" w:eastAsia="Calibri" w:hAnsi="Calibri"/>
+          <w:sz w:val="22"/>
+          <w:szCs w:val="22"/>
+        </w:rPr>
+        <w:t xml:space="preserve"> — obrigação de meio —, apurada mensalmente na forma do Anexo II e excluídas do cálculo as hipóteses dos itens 4.2 e 4.2.1. A consequência do descumprimento reiterado é a prevista no item 7.5, alínea "b".</w:t>
+      </w:r>
+    </w:p>
+    <w:p>
+      <w:pPr>
+        <w:spacing w:after="88" w:line="272"/>
         <w:ind w:left="300"/>
         <w:jc w:val="both"/>
       </w:pPr>
@@ -790,12 +931,63 @@
           <w:sz w:val="22"/>
           <w:szCs w:val="22"/>
         </w:rPr>
-        <w:t xml:space="preserve"> Não se computam como indisponibilidade nem geram responsabilidade da CONTRATADA: manutenções programadas comunicadas com 48 (quarenta e oito) horas de antecedência; falhas de energia elétrica, de internet ou dos equipamentos da CONTRATANTE, de seus moradores ou funcionários; falhas de terceiros dos quais o sistema dependa, como provedores de hospedagem em nuvem, instituições financeiras, emissores de boleto e lojas de aplicativos; uso indevido ou em desacordo com as orientações de treinamento; caso fortuito, força maior, ataques cibernéticos praticados por terceiros e determinações de autoridade competente.</w:t>
-      </w:r>
-    </w:p>
-    <w:p>
-      <w:pPr>
-        <w:spacing w:after="100" w:line="276"/>
+        <w:t xml:space="preserve"> Não se computam como indisponibilidade nem geram responsabilidade da CONTRATADA: (a) manutenções programadas comunicadas com 48 (quarenta e oito) horas de antecedência; (b) falhas de energia elétrica, de internet ou dos equipamentos da CONTRATANTE, de seus moradores ou funcionários; (c) uso indevido do sistema ou em desacordo com as orientações de treinamento; e (d) caso fortuito, força maior e determinações de autoridade competente.</w:t>
+      </w:r>
+    </w:p>
+    <w:p>
+      <w:pPr>
+        <w:spacing w:after="88" w:line="272"/>
+        <w:ind w:left="300"/>
+        <w:jc w:val="both"/>
+      </w:pPr>
+      <w:r>
+        <w:rPr>
+          <w:rFonts w:ascii="Calibri" w:cs="Calibri" w:eastAsia="Calibri" w:hAnsi="Calibri"/>
+          <w:sz w:val="22"/>
+          <w:szCs w:val="22"/>
+        </w:rPr>
+        <w:t xml:space="preserve">4.2.1. </w:t>
+      </w:r>
+      <w:r>
+        <w:rPr>
+          <w:rFonts w:ascii="Calibri" w:cs="Calibri" w:eastAsia="Calibri" w:hAnsi="Calibri"/>
+          <w:b/>
+          <w:bCs/>
+          <w:sz w:val="22"/>
+          <w:szCs w:val="22"/>
+        </w:rPr>
+        <w:t xml:space="preserve">Falhas de terceiros e ataques cibernéticos.</w:t>
+      </w:r>
+      <w:r>
+        <w:rPr>
+          <w:rFonts w:ascii="Calibri" w:cs="Calibri" w:eastAsia="Calibri" w:hAnsi="Calibri"/>
+          <w:sz w:val="22"/>
+          <w:szCs w:val="22"/>
+        </w:rPr>
+        <w:t xml:space="preserve"> As falhas de terceiros dos quais o sistema dependa — provedores de hospedagem em nuvem, instituições financeiras, emissores de boleto, lojas de aplicativos e demais suboperadores — e os ataques cibernéticos praticados por terceiros </w:t>
+      </w:r>
+      <w:r>
+        <w:rPr>
+          <w:rFonts w:ascii="Calibri" w:cs="Calibri" w:eastAsia="Calibri" w:hAnsi="Calibri"/>
+          <w:b/>
+          <w:bCs/>
+          <w:sz w:val="22"/>
+          <w:szCs w:val="22"/>
+        </w:rPr>
+        <w:t xml:space="preserve">somente excluem a responsabilidade da CONTRATADA quando esta demonstrar haver adotado as medidas técnicas, administrativas e de diligência previstas no item 5.1 e no Anexo II, inclusive na seleção e no acompanhamento desses terceiros</w:t>
+      </w:r>
+      <w:r>
+        <w:rPr>
+          <w:rFonts w:ascii="Calibri" w:cs="Calibri" w:eastAsia="Calibri" w:hAnsi="Calibri"/>
+          <w:sz w:val="22"/>
+          <w:szCs w:val="22"/>
+        </w:rPr>
+        <w:t xml:space="preserve">, na forma dos arts. 46 a 49 da LGPD.</w:t>
+      </w:r>
+    </w:p>
+    <w:p>
+      <w:pPr>
+        <w:spacing w:after="88" w:line="272"/>
         <w:ind w:left="300"/>
         <w:jc w:val="both"/>
       </w:pPr>
@@ -913,12 +1105,12 @@
           <w:sz w:val="22"/>
           <w:szCs w:val="22"/>
         </w:rPr>
-        <w:t xml:space="preserve">; solicitações recebidas fora do horário de atendimento ou por canal diverso dos oficiais têm seus prazos contados a partir do expediente seguinte, e o descumprimento pontual não configura justa causa, nos termos do item 7.6.</w:t>
-      </w:r>
-    </w:p>
-    <w:p>
-      <w:pPr>
-        <w:spacing w:after="100" w:line="276"/>
+        <w:t xml:space="preserve">; solicitações recebidas fora do horário de atendimento ou por canal diverso dos oficiais têm seus prazos contados a partir do expediente seguinte, e o descumprimento pontual não configura justa causa, nos termos do item 7.6. O procedimento de abertura e classificação de chamados consta do Anexo II.</w:t>
+      </w:r>
+    </w:p>
+    <w:p>
+      <w:pPr>
+        <w:spacing w:after="88" w:line="272"/>
         <w:ind w:left="300"/>
         <w:jc w:val="both"/>
       </w:pPr>
@@ -987,7 +1179,7 @@
     </w:p>
     <w:p>
       <w:pPr>
-        <w:spacing w:after="100" w:line="276"/>
+        <w:spacing w:after="88" w:line="272"/>
         <w:ind w:left="300"/>
         <w:jc w:val="both"/>
       </w:pPr>
@@ -1015,13 +1207,118 @@
           <w:sz w:val="22"/>
           <w:szCs w:val="22"/>
         </w:rPr>
-        <w:t xml:space="preserve"> A responsabilidade total da CONTRATADA, qualquer que seja o fundamento, limita-se ao valor efetivamente pago pela CONTRATANTE nos 12 (doze) meses anteriores ao evento que lhe deu causa. Nenhuma das partes responderá por lucros cessantes ou danos indiretos. Estas limitações não se aplicam a dolo ou culpa grave comprovados, nem afastam responsabilidades inafastáveis por lei.</w:t>
+        <w:t xml:space="preserve"> A responsabilidade total da CONTRATADA por perdas e danos limita-se ao valor efetivamente pago pela CONTRATANTE nos 12 (doze) meses anteriores ao evento que lhe deu causa. </w:t>
+      </w:r>
+      <w:r>
+        <w:rPr>
+          <w:rFonts w:ascii="Calibri" w:cs="Calibri" w:eastAsia="Calibri" w:hAnsi="Calibri"/>
+          <w:b/>
+          <w:bCs/>
+          <w:sz w:val="22"/>
+          <w:szCs w:val="22"/>
+        </w:rPr>
+        <w:t xml:space="preserve">Excetuam-se desse limite:</w:t>
+      </w:r>
+      <w:r>
+        <w:rPr>
+          <w:rFonts w:ascii="Calibri" w:cs="Calibri" w:eastAsia="Calibri" w:hAnsi="Calibri"/>
+          <w:sz w:val="22"/>
+          <w:szCs w:val="22"/>
+        </w:rPr>
+        <w:t xml:space="preserve"> (a) os danos decorrentes de dolo ou culpa grave comprovados e as obrigações trabalhistas, previdenciárias e tributárias próprias da CONTRATADA, que </w:t>
+      </w:r>
+      <w:r>
+        <w:rPr>
+          <w:rFonts w:ascii="Calibri" w:cs="Calibri" w:eastAsia="Calibri" w:hAnsi="Calibri"/>
+          <w:b/>
+          <w:bCs/>
+          <w:sz w:val="22"/>
+          <w:szCs w:val="22"/>
+        </w:rPr>
+        <w:t xml:space="preserve">não se sujeitam a limite algum</w:t>
+      </w:r>
+      <w:r>
+        <w:rPr>
+          <w:rFonts w:ascii="Calibri" w:cs="Calibri" w:eastAsia="Calibri" w:hAnsi="Calibri"/>
+          <w:sz w:val="22"/>
+          <w:szCs w:val="22"/>
+        </w:rPr>
+        <w:t xml:space="preserve">; (b) os danos decorrentes de quebra de confidencialidade, de incidente de segurança causado por falha da CONTRATADA ou de uso indevido de dados pessoais, sujeitos ao </w:t>
+      </w:r>
+      <w:r>
+        <w:rPr>
+          <w:rFonts w:ascii="Calibri" w:cs="Calibri" w:eastAsia="Calibri" w:hAnsi="Calibri"/>
+          <w:b/>
+          <w:bCs/>
+          <w:sz w:val="22"/>
+          <w:szCs w:val="22"/>
+        </w:rPr>
+        <w:t xml:space="preserve">limite especial de 24 (vinte e quatro) mensalidades</w:t>
+      </w:r>
+      <w:r>
+        <w:rPr>
+          <w:rFonts w:ascii="Calibri" w:cs="Calibri" w:eastAsia="Calibri" w:hAnsi="Calibri"/>
+          <w:sz w:val="22"/>
+          <w:szCs w:val="22"/>
+        </w:rPr>
+        <w:t xml:space="preserve">; e (c) a </w:t>
+      </w:r>
+      <w:r>
+        <w:rPr>
+          <w:rFonts w:ascii="Calibri" w:cs="Calibri" w:eastAsia="Calibri" w:hAnsi="Calibri"/>
+          <w:b/>
+          <w:bCs/>
+          <w:sz w:val="22"/>
+          <w:szCs w:val="22"/>
+        </w:rPr>
+        <w:t xml:space="preserve">restituição de valores pagos por serviço não prestado</w:t>
+      </w:r>
+      <w:r>
+        <w:rPr>
+          <w:rFonts w:ascii="Calibri" w:cs="Calibri" w:eastAsia="Calibri" w:hAnsi="Calibri"/>
+          <w:sz w:val="22"/>
+          <w:szCs w:val="22"/>
+        </w:rPr>
+        <w:t xml:space="preserve">, sempre devida. Nenhuma das partes responderá por lucros cessantes ou danos indiretos.</w:t>
+      </w:r>
+    </w:p>
+    <w:p>
+      <w:pPr>
+        <w:spacing w:after="88" w:line="272"/>
+        <w:ind w:left="300"/>
+        <w:jc w:val="both"/>
+      </w:pPr>
+      <w:r>
+        <w:rPr>
+          <w:rFonts w:ascii="Calibri" w:cs="Calibri" w:eastAsia="Calibri" w:hAnsi="Calibri"/>
+          <w:sz w:val="22"/>
+          <w:szCs w:val="22"/>
+        </w:rPr>
+        <w:t xml:space="preserve">4.6. </w:t>
+      </w:r>
+      <w:r>
+        <w:rPr>
+          <w:rFonts w:ascii="Calibri" w:cs="Calibri" w:eastAsia="Calibri" w:hAnsi="Calibri"/>
+          <w:b/>
+          <w:bCs/>
+          <w:sz w:val="22"/>
+          <w:szCs w:val="22"/>
+        </w:rPr>
+        <w:t xml:space="preserve">Ressalva de direitos indisponíveis.</w:t>
+      </w:r>
+      <w:r>
+        <w:rPr>
+          <w:rFonts w:ascii="Calibri" w:cs="Calibri" w:eastAsia="Calibri" w:hAnsi="Calibri"/>
+          <w:sz w:val="22"/>
+          <w:szCs w:val="22"/>
+        </w:rPr>
+        <w:t xml:space="preserve"> Nenhuma disposição deste contrato limita ou afasta direitos indisponíveis, a responsabilidade legal das partes, nem a reparação de danos decorrentes de dolo, culpa grave, violação de dados pessoais ou falha essencial na prestação dos serviços, aplicando-se, no que couber, as normas de ordem pública, inclusive o Código de Defesa do Consumidor quando incidente à relação.</w:t>
       </w:r>
     </w:p>
     <w:p>
       <w:pPr>
         <w:keepNext/>
-        <w:spacing w:after="110" w:before="240" w:line="276"/>
+        <w:spacing w:after="96" w:before="215" w:line="272"/>
       </w:pPr>
       <w:r>
         <w:rPr>
@@ -1037,7 +1334,7 @@
     </w:p>
     <w:p>
       <w:pPr>
-        <w:spacing w:after="100" w:line="276"/>
+        <w:spacing w:after="88" w:line="272"/>
         <w:ind w:left="300"/>
         <w:jc w:val="both"/>
       </w:pPr>
@@ -1065,12 +1362,12 @@
           <w:sz w:val="22"/>
           <w:szCs w:val="22"/>
         </w:rPr>
-        <w:t xml:space="preserve"> manter o sistema em funcionamento e prestar o suporte na forma da Cláusula Quarta; adotar medidas técnicas e administrativas de segurança da informação compatíveis com o estado da técnica, incluindo criptografia em trânsito, credenciais individuais e cópia de segurança diária; comunicar manutenções programadas com 48 (quarenta e oito) horas de antecedência; realizar a implantação e a capacitação inicial nos limites do item 3.2; e manter sigilo sobre as informações do condomínio a que tiver acesso.</w:t>
-      </w:r>
-    </w:p>
-    <w:p>
-      <w:pPr>
-        <w:spacing w:after="100" w:line="276"/>
+        <w:t xml:space="preserve"> manter o sistema em funcionamento e prestar o suporte na forma da Cláusula Quarta; adotar as medidas técnicas e administrativas de segurança da informação descritas no Anexo II, incluindo criptografia em trânsito e em repouso, credenciais individuais, registro de acessos administrativos e cópia de segurança diária; comunicar manutenções programadas com 48 (quarenta e oito) horas de antecedência; realizar a implantação e a capacitação inicial nos limites do item 3.2; e manter sigilo sobre as informações do condomínio a que tiver acesso.</w:t>
+      </w:r>
+    </w:p>
+    <w:p>
+      <w:pPr>
+        <w:spacing w:after="88" w:line="272"/>
         <w:ind w:left="300"/>
         <w:jc w:val="both"/>
       </w:pPr>
@@ -1098,13 +1395,13 @@
           <w:sz w:val="22"/>
           <w:szCs w:val="22"/>
         </w:rPr>
-        <w:t xml:space="preserve"> fornecer dados corretos e atualizados de unidades, moradores, funcionários e prestadores habituais; indicar responsável pela operação do sistema e interlocutor para assuntos de proteção de dados; zelar pelo sigilo de senhas, PINs e credenciais, respondendo pelo uso indevido por terceiros a quem tenha dado causa, e comunicar de imediato o desligamento de funcionários com acesso; manter equipamentos, energia e conexão de internet necessários ao funcionamento; obter e arquivar os consentimentos do item 6.3; e efetuar os pagamentos na forma da Cláusula Terceira.</w:t>
+        <w:t xml:space="preserve"> fornecer dados corretos e atualizados de unidades, moradores, funcionários e prestadores habituais; indicar responsável pela operação do sistema e interlocutor para assuntos de proteção de dados; zelar pelo sigilo de senhas, PINs e credenciais, respondendo pelo uso indevido por terceiros a quem tenha dado causa, e comunicar de imediato o desligamento de funcionários com acesso; manter equipamentos, energia e conexão de internet necessários ao funcionamento; prestar aos titulares as informações e, quando aplicável, colher os consentimentos do item 6.4; e efetuar os pagamentos na forma da Cláusula Terceira.</w:t>
       </w:r>
     </w:p>
     <w:p>
       <w:pPr>
         <w:keepNext/>
-        <w:spacing w:after="110" w:before="240" w:line="276"/>
+        <w:spacing w:after="96" w:before="215" w:line="272"/>
       </w:pPr>
       <w:r>
         <w:rPr>
@@ -1120,7 +1417,7 @@
     </w:p>
     <w:p>
       <w:pPr>
-        <w:spacing w:after="100" w:line="276"/>
+        <w:spacing w:after="88" w:line="272"/>
         <w:ind w:left="300"/>
         <w:jc w:val="both"/>
       </w:pPr>
@@ -1166,27 +1463,168 @@
           <w:sz w:val="22"/>
           <w:szCs w:val="22"/>
         </w:rPr>
-        <w:t xml:space="preserve">, tratando-os exclusivamente conforme as instruções da controladora e para a execução deste contrato. É vedado à CONTRATADA utilizá-los para finalidade diversa, compartilhá-los com terceiros não autorizados ou empregá-los em atividade comercial própria, em perfilamento ou no treinamento de modelos de inteligência artificial.</w:t>
-      </w:r>
-    </w:p>
-    <w:p>
-      <w:pPr>
-        <w:spacing w:after="100" w:line="276"/>
-        <w:ind w:left="300"/>
-        <w:jc w:val="both"/>
-      </w:pPr>
-      <w:r>
-        <w:rPr>
-          <w:rFonts w:ascii="Calibri" w:cs="Calibri" w:eastAsia="Calibri" w:hAnsi="Calibri"/>
-          <w:sz w:val="22"/>
-          <w:szCs w:val="22"/>
-        </w:rPr>
-        <w:t xml:space="preserve">6.2. A CONTRATADA comunicará à CONTRATANTE, em até 48 (quarenta e oito) horas do conhecimento do fato, incidente de segurança que possa acarretar risco ou dano relevante aos titulares, cabendo à CONTRATANTE, como controladora, a comunicação à ANPD e aos titulares; auxiliará no atendimento a requisições de titulares em até 10 (dez) dias; e manterá registro das operações de tratamento (art. 37 da LGPD). A CONTRATANTE autoriza os suboperadores necessários à prestação — hospedagem em nuvem, sistema financeiro integrado e serviços de notificação —, obrigando-se a CONTRATADA a exigir deles proteção equivalente e a responder por seus atos.</w:t>
-      </w:r>
-    </w:p>
-    <w:p>
-      <w:pPr>
-        <w:spacing w:after="100" w:line="276"/>
+        <w:t xml:space="preserve">, tratando-os exclusivamente conforme as instruções da controladora e para a execução deste contrato. A repartição de decisões entre as partes — quais dados são coletados, prazos de retenção, quem tem acesso, funcionalidades ativadas, base legal aplicável e resposta a titulares — consta da </w:t>
+      </w:r>
+      <w:r>
+        <w:rPr>
+          <w:rFonts w:ascii="Calibri" w:cs="Calibri" w:eastAsia="Calibri" w:hAnsi="Calibri"/>
+          <w:b/>
+          <w:bCs/>
+          <w:sz w:val="22"/>
+          <w:szCs w:val="22"/>
+        </w:rPr>
+        <w:t xml:space="preserve">matriz de responsabilidades do Anexo II</w:t>
+      </w:r>
+      <w:r>
+        <w:rPr>
+          <w:rFonts w:ascii="Calibri" w:cs="Calibri" w:eastAsia="Calibri" w:hAnsi="Calibri"/>
+          <w:sz w:val="22"/>
+          <w:szCs w:val="22"/>
+        </w:rPr>
+        <w:t xml:space="preserve">. É vedado à CONTRATADA utilizar tais dados para finalidade diversa, compartilhá-los com terceiros não autorizados ou empregá-los em atividade comercial própria, em perfilamento ou no treinamento de modelos de inteligência artificial.</w:t>
+      </w:r>
+    </w:p>
+    <w:p>
+      <w:pPr>
+        <w:spacing w:after="88" w:line="272"/>
+        <w:ind w:left="300"/>
+        <w:jc w:val="both"/>
+      </w:pPr>
+      <w:r>
+        <w:rPr>
+          <w:rFonts w:ascii="Calibri" w:cs="Calibri" w:eastAsia="Calibri" w:hAnsi="Calibri"/>
+          <w:sz w:val="22"/>
+          <w:szCs w:val="22"/>
+        </w:rPr>
+        <w:t xml:space="preserve">6.1.1. </w:t>
+      </w:r>
+      <w:r>
+        <w:rPr>
+          <w:rFonts w:ascii="Calibri" w:cs="Calibri" w:eastAsia="Calibri" w:hAnsi="Calibri"/>
+          <w:b/>
+          <w:bCs/>
+          <w:sz w:val="22"/>
+          <w:szCs w:val="22"/>
+        </w:rPr>
+        <w:t xml:space="preserve">Obrigações próprias da operadora.</w:t>
+      </w:r>
+      <w:r>
+        <w:rPr>
+          <w:rFonts w:ascii="Calibri" w:cs="Calibri" w:eastAsia="Calibri" w:hAnsi="Calibri"/>
+          <w:sz w:val="22"/>
+          <w:szCs w:val="22"/>
+        </w:rPr>
+        <w:t xml:space="preserve"> A repartição de decisões prevista neste contrato e no Anexo II </w:t>
+      </w:r>
+      <w:r>
+        <w:rPr>
+          <w:rFonts w:ascii="Calibri" w:cs="Calibri" w:eastAsia="Calibri" w:hAnsi="Calibri"/>
+          <w:b/>
+          <w:bCs/>
+          <w:sz w:val="22"/>
+          <w:szCs w:val="22"/>
+        </w:rPr>
+        <w:t xml:space="preserve">não exonera a CONTRATADA das obrigações que a LGPD lhe impõe diretamente</w:t>
+      </w:r>
+      <w:r>
+        <w:rPr>
+          <w:rFonts w:ascii="Calibri" w:cs="Calibri" w:eastAsia="Calibri" w:hAnsi="Calibri"/>
+          <w:sz w:val="22"/>
+          <w:szCs w:val="22"/>
+        </w:rPr>
+        <w:t xml:space="preserve">, notadamente a segurança da plataforma, a seleção e o acompanhamento dos suboperadores, a implementação técnica dos prazos de retenção, a geração e a guarda dos logs, a execução operacional das requisições de titulares e a eliminação dos dados, respondendo a CONTRATADA na forma dos arts. 42 a 44 da LGPD quando descumprir a legislação ou deixar de seguir as instruções lícitas da CONTRATANTE.</w:t>
+      </w:r>
+    </w:p>
+    <w:p>
+      <w:pPr>
+        <w:spacing w:after="88" w:line="272"/>
+        <w:ind w:left="300"/>
+        <w:jc w:val="both"/>
+      </w:pPr>
+      <w:r>
+        <w:rPr>
+          <w:rFonts w:ascii="Calibri" w:cs="Calibri" w:eastAsia="Calibri" w:hAnsi="Calibri"/>
+          <w:sz w:val="22"/>
+          <w:szCs w:val="22"/>
+        </w:rPr>
+        <w:t xml:space="preserve">6.2. </w:t>
+      </w:r>
+      <w:r>
+        <w:rPr>
+          <w:rFonts w:ascii="Calibri" w:cs="Calibri" w:eastAsia="Calibri" w:hAnsi="Calibri"/>
+          <w:b/>
+          <w:bCs/>
+          <w:sz w:val="22"/>
+          <w:szCs w:val="22"/>
+        </w:rPr>
+        <w:t xml:space="preserve">Incidentes de segurança.</w:t>
+      </w:r>
+      <w:r>
+        <w:rPr>
+          <w:rFonts w:ascii="Calibri" w:cs="Calibri" w:eastAsia="Calibri" w:hAnsi="Calibri"/>
+          <w:sz w:val="22"/>
+          <w:szCs w:val="22"/>
+        </w:rPr>
+        <w:t xml:space="preserve"> A CONTRATADA comunicará à CONTRATANTE, pelo canal emergencial indicado no Anexo II, em até 48 (quarenta e oito) horas do conhecimento do fato e </w:t>
+      </w:r>
+      <w:r>
+        <w:rPr>
+          <w:rFonts w:ascii="Calibri" w:cs="Calibri" w:eastAsia="Calibri" w:hAnsi="Calibri"/>
+          <w:b/>
+          <w:bCs/>
+          <w:sz w:val="22"/>
+          <w:szCs w:val="22"/>
+        </w:rPr>
+        <w:t xml:space="preserve">ainda que não haja certeza sobre a extensão do incidente</w:t>
+      </w:r>
+      <w:r>
+        <w:rPr>
+          <w:rFonts w:ascii="Calibri" w:cs="Calibri" w:eastAsia="Calibri" w:hAnsi="Calibri"/>
+          <w:sz w:val="22"/>
+          <w:szCs w:val="22"/>
+        </w:rPr>
+        <w:t xml:space="preserve">, qualquer incidente de segurança que possa acarretar risco ou dano relevante aos titulares, informando os dados e titulares afetados, os riscos envolvidos e as medidas de mitigação, com atualizações periódicas até o encerramento. A CONTRATADA preservará logs e evidências e cooperará na investigação. Cabe à </w:t>
+      </w:r>
+      <w:r>
+        <w:rPr>
+          <w:rFonts w:ascii="Calibri" w:cs="Calibri" w:eastAsia="Calibri" w:hAnsi="Calibri"/>
+          <w:b/>
+          <w:bCs/>
+          <w:sz w:val="22"/>
+          <w:szCs w:val="22"/>
+        </w:rPr>
+        <w:t xml:space="preserve">CONTRATANTE</w:t>
+      </w:r>
+      <w:r>
+        <w:rPr>
+          <w:rFonts w:ascii="Calibri" w:cs="Calibri" w:eastAsia="Calibri" w:hAnsi="Calibri"/>
+          <w:sz w:val="22"/>
+          <w:szCs w:val="22"/>
+        </w:rPr>
+        <w:t xml:space="preserve">, como controladora, comunicar a ANPD e os titulares. Os </w:t>
+      </w:r>
+      <w:r>
+        <w:rPr>
+          <w:rFonts w:ascii="Calibri" w:cs="Calibri" w:eastAsia="Calibri" w:hAnsi="Calibri"/>
+          <w:b/>
+          <w:bCs/>
+          <w:sz w:val="22"/>
+          <w:szCs w:val="22"/>
+        </w:rPr>
+        <w:t xml:space="preserve">custos de contenção correm por conta da CONTRATADA</w:t>
+      </w:r>
+      <w:r>
+        <w:rPr>
+          <w:rFonts w:ascii="Calibri" w:cs="Calibri" w:eastAsia="Calibri" w:hAnsi="Calibri"/>
+          <w:sz w:val="22"/>
+          <w:szCs w:val="22"/>
+        </w:rPr>
+        <w:t xml:space="preserve"> quando o incidente decorrer de falha sua.</w:t>
+      </w:r>
+    </w:p>
+    <w:p>
+      <w:pPr>
+        <w:spacing w:after="88" w:line="272"/>
         <w:ind w:left="300"/>
         <w:jc w:val="both"/>
       </w:pPr>
@@ -1206,6 +1644,39 @@
           <w:sz w:val="22"/>
           <w:szCs w:val="22"/>
         </w:rPr>
+        <w:t xml:space="preserve">Titulares e suboperadores.</w:t>
+      </w:r>
+      <w:r>
+        <w:rPr>
+          <w:rFonts w:ascii="Calibri" w:cs="Calibri" w:eastAsia="Calibri" w:hAnsi="Calibri"/>
+          <w:sz w:val="22"/>
+          <w:szCs w:val="22"/>
+        </w:rPr>
+        <w:t xml:space="preserve"> A CONTRATADA auxiliará a CONTRATANTE no atendimento a requisições de titulares — confirmação, acesso, correção, anonimização, portabilidade, eliminação, revogação de consentimento e oposição — em até 10 (dez) dias, e manterá registro das operações de tratamento (art. 37 da LGPD). A CONTRATANTE autoriza os suboperadores necessários à prestação, listados por categoria no Anexo II, obrigando-se a CONTRATADA a exigir deles proteção equivalente, a responder por seus atos e a informar previamente alterações relevantes.</w:t>
+      </w:r>
+    </w:p>
+    <w:p>
+      <w:pPr>
+        <w:spacing w:after="88" w:line="272"/>
+        <w:ind w:left="300"/>
+        <w:jc w:val="both"/>
+      </w:pPr>
+      <w:r>
+        <w:rPr>
+          <w:rFonts w:ascii="Calibri" w:cs="Calibri" w:eastAsia="Calibri" w:hAnsi="Calibri"/>
+          <w:sz w:val="22"/>
+          <w:szCs w:val="22"/>
+        </w:rPr>
+        <w:t xml:space="preserve">6.4. </w:t>
+      </w:r>
+      <w:r>
+        <w:rPr>
+          <w:rFonts w:ascii="Calibri" w:cs="Calibri" w:eastAsia="Calibri" w:hAnsi="Calibri"/>
+          <w:b/>
+          <w:bCs/>
+          <w:sz w:val="22"/>
+          <w:szCs w:val="22"/>
+        </w:rPr>
         <w:t xml:space="preserve">Dados biométricos.</w:t>
       </w:r>
       <w:r>
@@ -1232,61 +1703,61 @@
           <w:sz w:val="22"/>
           <w:szCs w:val="22"/>
         </w:rPr>
-        <w:t xml:space="preserve"> (art. 5º, II, da LGPD) e seu tratamento depende de </w:t>
-      </w:r>
-      <w:r>
-        <w:rPr>
-          <w:rFonts w:ascii="Calibri" w:cs="Calibri" w:eastAsia="Calibri" w:hAnsi="Calibri"/>
-          <w:b/>
-          <w:bCs/>
-          <w:sz w:val="22"/>
-          <w:szCs w:val="22"/>
-        </w:rPr>
-        <w:t xml:space="preserve">consentimento específico e destacado</w:t>
-      </w:r>
-      <w:r>
-        <w:rPr>
-          <w:rFonts w:ascii="Calibri" w:cs="Calibri" w:eastAsia="Calibri" w:hAnsi="Calibri"/>
-          <w:sz w:val="22"/>
-          <w:szCs w:val="22"/>
-        </w:rPr>
-        <w:t xml:space="preserve"> do titular (art. 11, I). Cabe </w:t>
-      </w:r>
-      <w:r>
-        <w:rPr>
-          <w:rFonts w:ascii="Calibri" w:cs="Calibri" w:eastAsia="Calibri" w:hAnsi="Calibri"/>
-          <w:b/>
-          <w:bCs/>
-          <w:sz w:val="22"/>
-          <w:szCs w:val="22"/>
-        </w:rPr>
-        <w:t xml:space="preserve">exclusivamente à CONTRATANTE</w:t>
-      </w:r>
-      <w:r>
-        <w:rPr>
-          <w:rFonts w:ascii="Calibri" w:cs="Calibri" w:eastAsia="Calibri" w:hAnsi="Calibri"/>
-          <w:sz w:val="22"/>
-          <w:szCs w:val="22"/>
-        </w:rPr>
-        <w:t xml:space="preserve"> colher, documentar e arquivar esse consentimento e </w:t>
-      </w:r>
-      <w:r>
-        <w:rPr>
-          <w:rFonts w:ascii="Calibri" w:cs="Calibri" w:eastAsia="Calibri" w:hAnsi="Calibri"/>
-          <w:b/>
-          <w:bCs/>
-          <w:sz w:val="22"/>
-          <w:szCs w:val="22"/>
-        </w:rPr>
-        <w:t xml:space="preserve">oferecer alternativa de acesso de igual eficácia</w:t>
-      </w:r>
-      <w:r>
-        <w:rPr>
-          <w:rFonts w:ascii="Calibri" w:cs="Calibri" w:eastAsia="Calibri" w:hAnsi="Calibri"/>
-          <w:sz w:val="22"/>
-          <w:szCs w:val="22"/>
-        </w:rPr>
-        <w:t xml:space="preserve"> — PIN, QR Code, identificação documental ou liberação pela portaria — a quem não consentir, sendo </w:t>
+        <w:t xml:space="preserve"> (art. 5º, II, da LGPD). Seu tratamento será realizado com fundamento na hipótese legal adequada à finalidade e às circunstâncias concretas — </w:t>
+      </w:r>
+      <w:r>
+        <w:rPr>
+          <w:rFonts w:ascii="Calibri" w:cs="Calibri" w:eastAsia="Calibri" w:hAnsi="Calibri"/>
+          <w:b/>
+          <w:bCs/>
+          <w:sz w:val="22"/>
+          <w:szCs w:val="22"/>
+        </w:rPr>
+        <w:t xml:space="preserve">mediante consentimento específico e destacado do titular (art. 11, I) quando esta for a base aplicável, ou em outra hipótese autorizativa prevista em lei</w:t>
+      </w:r>
+      <w:r>
+        <w:rPr>
+          <w:rFonts w:ascii="Calibri" w:cs="Calibri" w:eastAsia="Calibri" w:hAnsi="Calibri"/>
+          <w:sz w:val="22"/>
+          <w:szCs w:val="22"/>
+        </w:rPr>
+        <w:t xml:space="preserve">, notadamente a garantia da prevenção à fraude e à segurança do titular nos processos de identificação e autenticação (art. 11, II, alínea "g"). Cabe à </w:t>
+      </w:r>
+      <w:r>
+        <w:rPr>
+          <w:rFonts w:ascii="Calibri" w:cs="Calibri" w:eastAsia="Calibri" w:hAnsi="Calibri"/>
+          <w:b/>
+          <w:bCs/>
+          <w:sz w:val="22"/>
+          <w:szCs w:val="22"/>
+        </w:rPr>
+        <w:t xml:space="preserve">CONTRATANTE</w:t>
+      </w:r>
+      <w:r>
+        <w:rPr>
+          <w:rFonts w:ascii="Calibri" w:cs="Calibri" w:eastAsia="Calibri" w:hAnsi="Calibri"/>
+          <w:sz w:val="22"/>
+          <w:szCs w:val="22"/>
+        </w:rPr>
+        <w:t xml:space="preserve">, como controladora, definir a base legal, prestar aos titulares o aviso de privacidade específico e, quando a base for o consentimento, colhê-lo, documentá-lo e arquivá-lo. </w:t>
+      </w:r>
+      <w:r>
+        <w:rPr>
+          <w:rFonts w:ascii="Calibri" w:cs="Calibri" w:eastAsia="Calibri" w:hAnsi="Calibri"/>
+          <w:b/>
+          <w:bCs/>
+          <w:sz w:val="22"/>
+          <w:szCs w:val="22"/>
+        </w:rPr>
+        <w:t xml:space="preserve">Em qualquer hipótese</w:t>
+      </w:r>
+      <w:r>
+        <w:rPr>
+          <w:rFonts w:ascii="Calibri" w:cs="Calibri" w:eastAsia="Calibri" w:hAnsi="Calibri"/>
+          <w:sz w:val="22"/>
+          <w:szCs w:val="22"/>
+        </w:rPr>
+        <w:t xml:space="preserve">, a CONTRATANTE oferecerá alternativa de acesso de igual eficácia — PIN, QR Code, identificação documental ou liberação pela portaria — a quem não fornecer a biometria, sendo </w:t>
       </w:r>
       <w:r>
         <w:rPr>
@@ -1304,28 +1775,64 @@
           <w:sz w:val="22"/>
           <w:szCs w:val="22"/>
         </w:rPr>
-        <w:t xml:space="preserve">. O dado será tratado apenas para identificação no controle de acesso, armazenado de forma criptografada e eliminado em até 30 (trinta) dias contados do fim do vínculo do titular, da revogação do consentimento ou do término do contrato, o que primeiro ocorrer. Enquanto o módulo de reconhecimento facial não for ativado, este item permanece sem eficácia.</w:t>
-      </w:r>
-    </w:p>
-    <w:p>
-      <w:pPr>
-        <w:spacing w:after="100" w:line="276"/>
-        <w:ind w:left="300"/>
-        <w:jc w:val="both"/>
-      </w:pPr>
-      <w:r>
-        <w:rPr>
-          <w:rFonts w:ascii="Calibri" w:cs="Calibri" w:eastAsia="Calibri" w:hAnsi="Calibri"/>
-          <w:sz w:val="22"/>
-          <w:szCs w:val="22"/>
-        </w:rPr>
-        <w:t xml:space="preserve">6.4. Contatos para proteção de dados: CONTRATANTE __________________________ · CONTRATADA contato@prestaregestao.com.br.</w:t>
+        <w:t xml:space="preserve">. O dado será tratado apenas para identificação no controle de acesso, armazenado de forma criptografada e eliminado </w:t>
+      </w:r>
+      <w:r>
+        <w:rPr>
+          <w:rFonts w:ascii="Calibri" w:cs="Calibri" w:eastAsia="Calibri" w:hAnsi="Calibri"/>
+          <w:b/>
+          <w:bCs/>
+          <w:sz w:val="22"/>
+          <w:szCs w:val="22"/>
+        </w:rPr>
+        <w:t xml:space="preserve">das bases de produção em até 30 (trinta) dias</w:t>
+      </w:r>
+      <w:r>
+        <w:rPr>
+          <w:rFonts w:ascii="Calibri" w:cs="Calibri" w:eastAsia="Calibri" w:hAnsi="Calibri"/>
+          <w:sz w:val="22"/>
+          <w:szCs w:val="22"/>
+        </w:rPr>
+        <w:t xml:space="preserve"> contados do fim do vínculo do titular, da revogação do consentimento ou de oposição legítima, ou do término do contrato, o que primeiro ocorrer, </w:t>
+      </w:r>
+      <w:r>
+        <w:rPr>
+          <w:rFonts w:ascii="Calibri" w:cs="Calibri" w:eastAsia="Calibri" w:hAnsi="Calibri"/>
+          <w:b/>
+          <w:bCs/>
+          <w:sz w:val="22"/>
+          <w:szCs w:val="22"/>
+        </w:rPr>
+        <w:t xml:space="preserve">e das cópias de segurança no ciclo técnico subsequente, que não excederá 90 (noventa) dias</w:t>
+      </w:r>
+      <w:r>
+        <w:rPr>
+          <w:rFonts w:ascii="Calibri" w:cs="Calibri" w:eastAsia="Calibri" w:hAnsi="Calibri"/>
+          <w:sz w:val="22"/>
+          <w:szCs w:val="22"/>
+        </w:rPr>
+        <w:t xml:space="preserve">; eventual transferência internacional observará os arts. 33 a 36 da LGPD e será previamente informada à CONTRATANTE. O detalhamento operacional consta do Anexo II. Enquanto o módulo de reconhecimento facial não for ativado, este item permanece sem eficácia.</w:t>
+      </w:r>
+    </w:p>
+    <w:p>
+      <w:pPr>
+        <w:spacing w:after="88" w:line="272"/>
+        <w:ind w:left="300"/>
+        <w:jc w:val="both"/>
+      </w:pPr>
+      <w:r>
+        <w:rPr>
+          <w:rFonts w:ascii="Calibri" w:cs="Calibri" w:eastAsia="Calibri" w:hAnsi="Calibri"/>
+          <w:sz w:val="22"/>
+          <w:szCs w:val="22"/>
+        </w:rPr>
+        <w:t xml:space="preserve">6.5. Contatos para proteção de dados: CONTRATANTE __________________________ · CONTRATADA contato@prestaregestao.com.br.</w:t>
       </w:r>
     </w:p>
     <w:p>
       <w:pPr>
         <w:keepNext/>
-        <w:spacing w:after="110" w:before="240" w:line="276"/>
+        <w:spacing w:after="96" w:before="215" w:line="272"/>
       </w:pPr>
       <w:r>
         <w:rPr>
@@ -1341,37 +1848,55 @@
     </w:p>
     <w:p>
       <w:pPr>
-        <w:spacing w:after="100" w:line="276"/>
-        <w:ind w:left="300"/>
-        <w:jc w:val="both"/>
-      </w:pPr>
-      <w:r>
-        <w:rPr>
-          <w:rFonts w:ascii="Calibri" w:cs="Calibri" w:eastAsia="Calibri" w:hAnsi="Calibri"/>
-          <w:sz w:val="22"/>
-          <w:szCs w:val="22"/>
-        </w:rPr>
-        <w:t xml:space="preserve">7.1. O descumprimento de qualquer cláusula faculta à parte prejudicada notificar a outra por escrito, concedendo-lhe prazo de 15 (quinze) dias para sanar a irregularidade, sob pena de rescisão — ressalvado o regime de inadimplência do item 3.5 e observados, quanto à justa causa imputável à CONTRATADA, os itens 7.5 a 7.7.</w:t>
-      </w:r>
-    </w:p>
-    <w:p>
-      <w:pPr>
-        <w:spacing w:after="100" w:line="276"/>
-        <w:ind w:left="300"/>
-        <w:jc w:val="both"/>
-      </w:pPr>
-      <w:r>
-        <w:rPr>
-          <w:rFonts w:ascii="Calibri" w:cs="Calibri" w:eastAsia="Calibri" w:hAnsi="Calibri"/>
-          <w:sz w:val="22"/>
-          <w:szCs w:val="22"/>
-        </w:rPr>
-        <w:t xml:space="preserve">7.2. É facultado a qualquer das partes rescindir este contrato sem justa causa, mediante aviso prévio escrito de 30 (trinta) dias.</w:t>
-      </w:r>
-    </w:p>
-    <w:p>
-      <w:pPr>
-        <w:spacing w:after="100" w:line="276"/>
+        <w:spacing w:after="88" w:line="272"/>
+        <w:ind w:left="300"/>
+        <w:jc w:val="both"/>
+      </w:pPr>
+      <w:r>
+        <w:rPr>
+          <w:rFonts w:ascii="Calibri" w:cs="Calibri" w:eastAsia="Calibri" w:hAnsi="Calibri"/>
+          <w:sz w:val="22"/>
+          <w:szCs w:val="22"/>
+        </w:rPr>
+        <w:t xml:space="preserve">7.1. O descumprimento de qualquer cláusula faculta à parte prejudicada notificar a outra por escrito, concedendo-lhe prazo de 15 (quinze) dias para sanar a irregularidade, sob pena de rescisão — ressalvado o regime de inadimplência do item 3.5 e observados, quanto à justa causa imputável à CONTRATADA, os itens 7.5 a 7.7. O prazo de cura </w:t>
+      </w:r>
+      <w:r>
+        <w:rPr>
+          <w:rFonts w:ascii="Calibri" w:cs="Calibri" w:eastAsia="Calibri" w:hAnsi="Calibri"/>
+          <w:b/>
+          <w:bCs/>
+          <w:sz w:val="22"/>
+          <w:szCs w:val="22"/>
+        </w:rPr>
+        <w:t xml:space="preserve">não se aplica</w:t>
+      </w:r>
+      <w:r>
+        <w:rPr>
+          <w:rFonts w:ascii="Calibri" w:cs="Calibri" w:eastAsia="Calibri" w:hAnsi="Calibri"/>
+          <w:sz w:val="22"/>
+          <w:szCs w:val="22"/>
+        </w:rPr>
+        <w:t xml:space="preserve"> à hipótese do item 7.5, alínea "c".</w:t>
+      </w:r>
+    </w:p>
+    <w:p>
+      <w:pPr>
+        <w:spacing w:after="88" w:line="272"/>
+        <w:ind w:left="300"/>
+        <w:jc w:val="both"/>
+      </w:pPr>
+      <w:r>
+        <w:rPr>
+          <w:rFonts w:ascii="Calibri" w:cs="Calibri" w:eastAsia="Calibri" w:hAnsi="Calibri"/>
+          <w:sz w:val="22"/>
+          <w:szCs w:val="22"/>
+        </w:rPr>
+        <w:t xml:space="preserve">7.2. É facultado a qualquer das partes rescindir este contrato sem justa causa, mediante aviso prévio escrito de 30 (trinta) dias, permanecendo devidas as mensalidades do período de aviso.</w:t>
+      </w:r>
+    </w:p>
+    <w:p>
+      <w:pPr>
+        <w:spacing w:after="88" w:line="272"/>
         <w:ind w:left="300"/>
         <w:jc w:val="both"/>
       </w:pPr>
@@ -1399,30 +1924,99 @@
           <w:sz w:val="22"/>
           <w:szCs w:val="22"/>
         </w:rPr>
-        <w:t xml:space="preserve"> Rescindindo a CONTRATANTE sem justa causa antes do termo final da vigência em curso, será devida à CONTRATADA, a título de cláusula penal compensatória (arts. 408 e 409 do Código Civil), multa de </w:t>
-      </w:r>
-      <w:r>
-        <w:rPr>
-          <w:rFonts w:ascii="Calibri" w:cs="Calibri" w:eastAsia="Calibri" w:hAnsi="Calibri"/>
-          <w:b/>
-          <w:bCs/>
-          <w:sz w:val="22"/>
-          <w:szCs w:val="22"/>
-        </w:rPr>
-        <w:t xml:space="preserve">30% (trinta por cento) do somatório das mensalidades vincendas</w:t>
-      </w:r>
-      <w:r>
-        <w:rPr>
-          <w:rFonts w:ascii="Calibri" w:cs="Calibri" w:eastAsia="Calibri" w:hAnsi="Calibri"/>
-          <w:sz w:val="22"/>
-          <w:szCs w:val="22"/>
-        </w:rPr>
-        <w:t xml:space="preserve"> até o termo final, calculadas pelo valor da mensalidade vigente na data da rescisão. Havendo saldo de implantação parcelada, ou desconto e isenção concedidos sobre ela, o saldo ou o valor dispensado vencerá antecipadamente e somar-se-á à multa.</w:t>
-      </w:r>
-    </w:p>
-    <w:p>
-      <w:pPr>
-        <w:spacing w:after="100" w:line="276"/>
+        <w:t xml:space="preserve"> Rescindindo a CONTRATANTE sem justa causa antes do termo final da vigência em curso, será devida cláusula penal compensatória (arts. 408 e 409 do Código Civil), </w:t>
+      </w:r>
+      <w:r>
+        <w:rPr>
+          <w:rFonts w:ascii="Calibri" w:cs="Calibri" w:eastAsia="Calibri" w:hAnsi="Calibri"/>
+          <w:b/>
+          <w:bCs/>
+          <w:sz w:val="22"/>
+          <w:szCs w:val="22"/>
+        </w:rPr>
+        <w:t xml:space="preserve">decrescente e proporcional ao tempo restante</w:t>
+      </w:r>
+      <w:r>
+        <w:rPr>
+          <w:rFonts w:ascii="Calibri" w:cs="Calibri" w:eastAsia="Calibri" w:hAnsi="Calibri"/>
+          <w:sz w:val="22"/>
+          <w:szCs w:val="22"/>
+        </w:rPr>
+        <w:t xml:space="preserve">, calculada pela fórmula: </w:t>
+      </w:r>
+      <w:r>
+        <w:rPr>
+          <w:rFonts w:ascii="Calibri" w:cs="Calibri" w:eastAsia="Calibri" w:hAnsi="Calibri"/>
+          <w:b/>
+          <w:bCs/>
+          <w:sz w:val="22"/>
+          <w:szCs w:val="22"/>
+        </w:rPr>
+        <w:t xml:space="preserve">3 (três) mensalidades × (meses restantes ÷ 12)</w:t>
+      </w:r>
+      <w:r>
+        <w:rPr>
+          <w:rFonts w:ascii="Calibri" w:cs="Calibri" w:eastAsia="Calibri" w:hAnsi="Calibri"/>
+          <w:sz w:val="22"/>
+          <w:szCs w:val="22"/>
+        </w:rPr>
+        <w:t xml:space="preserve">, tomando-se a mensalidade vigente na data da rescisão e desprezadas as frações de mês. A multa </w:t>
+      </w:r>
+      <w:r>
+        <w:rPr>
+          <w:rFonts w:ascii="Calibri" w:cs="Calibri" w:eastAsia="Calibri" w:hAnsi="Calibri"/>
+          <w:b/>
+          <w:bCs/>
+          <w:sz w:val="22"/>
+          <w:szCs w:val="22"/>
+        </w:rPr>
+        <w:t xml:space="preserve">jamais excederá 3 (três) mensalidades</w:t>
+      </w:r>
+      <w:r>
+        <w:rPr>
+          <w:rFonts w:ascii="Calibri" w:cs="Calibri" w:eastAsia="Calibri" w:hAnsi="Calibri"/>
+          <w:sz w:val="22"/>
+          <w:szCs w:val="22"/>
+        </w:rPr>
+        <w:t xml:space="preserve"> e reduz-se a zero ao término da vigência. *Exemplo, para mensalidade de R$ 298,00: rescisão faltando 9 meses = R$ 670,50; faltando 4 meses = R$ 298,00; faltando 1 mês = R$ 74,50.*</w:t>
+      </w:r>
+    </w:p>
+    <w:p>
+      <w:pPr>
+        <w:spacing w:after="88" w:line="272"/>
+        <w:ind w:left="300"/>
+        <w:jc w:val="both"/>
+      </w:pPr>
+      <w:r>
+        <w:rPr>
+          <w:rFonts w:ascii="Calibri" w:cs="Calibri" w:eastAsia="Calibri" w:hAnsi="Calibri"/>
+          <w:sz w:val="22"/>
+          <w:szCs w:val="22"/>
+        </w:rPr>
+        <w:t xml:space="preserve">7.3.1. A taxa de implantação </w:t>
+      </w:r>
+      <w:r>
+        <w:rPr>
+          <w:rFonts w:ascii="Calibri" w:cs="Calibri" w:eastAsia="Calibri" w:hAnsi="Calibri"/>
+          <w:b/>
+          <w:bCs/>
+          <w:sz w:val="22"/>
+          <w:szCs w:val="22"/>
+        </w:rPr>
+        <w:t xml:space="preserve">já integralmente paga não é cobrada novamente nem se soma à multa</w:t>
+      </w:r>
+      <w:r>
+        <w:rPr>
+          <w:rFonts w:ascii="Calibri" w:cs="Calibri" w:eastAsia="Calibri" w:hAnsi="Calibri"/>
+          <w:sz w:val="22"/>
+          <w:szCs w:val="22"/>
+        </w:rPr>
+        <w:t xml:space="preserve">. Havendo saldo parcelado em aberto, apenas esse saldo vence antecipadamente na data da rescisão.</w:t>
+      </w:r>
+    </w:p>
+    <w:p>
+      <w:pPr>
+        <w:spacing w:after="88" w:line="272"/>
         <w:ind w:left="300"/>
         <w:jc w:val="both"/>
       </w:pPr>
@@ -1455,7 +2049,7 @@
     </w:p>
     <w:p>
       <w:pPr>
-        <w:spacing w:after="100" w:line="276"/>
+        <w:spacing w:after="88" w:line="272"/>
         <w:ind w:left="300"/>
         <w:jc w:val="both"/>
       </w:pPr>
@@ -1483,12 +2077,12 @@
           <w:sz w:val="22"/>
           <w:szCs w:val="22"/>
         </w:rPr>
-        <w:t xml:space="preserve"> Somente a configura: (a) indisponibilidade total do sistema, por causa imputável à CONTRATADA, por período superior a 5 (cinco) dias corridos e ininterruptos; (b) disponibilidade mensal inferior a 90% (noventa por cento), apurada na forma da Cláusula Quarta, por 3 (três) meses consecutivos; ou (c) violação comprovada dos deveres de sigilo ou de proteção de dados da Cláusula Sexta, da qual decorra dano efetivo à CONTRATANTE ou aos titulares.</w:t>
-      </w:r>
-    </w:p>
-    <w:p>
-      <w:pPr>
-        <w:spacing w:after="100" w:line="276"/>
+        <w:t xml:space="preserve"> Somente a configura: (a) indisponibilidade total do sistema, por causa imputável à CONTRATADA, por período superior a 5 (cinco) dias corridos e ininterruptos; (b) disponibilidade mensal inferior a 90% (noventa por cento), apurada na forma do Anexo II, por 3 (três) meses consecutivos; ou (c) violação comprovada dos deveres de sigilo ou de proteção de dados da Cláusula Sexta, da qual decorra dano efetivo à CONTRATANTE ou aos titulares.</w:t>
+      </w:r>
+    </w:p>
+    <w:p>
+      <w:pPr>
+        <w:spacing w:after="88" w:line="272"/>
         <w:ind w:left="300"/>
         <w:jc w:val="both"/>
       </w:pPr>
@@ -1516,27 +2110,27 @@
           <w:sz w:val="22"/>
           <w:szCs w:val="22"/>
         </w:rPr>
-        <w:t xml:space="preserve">, isolada ou cumulativamente: falhas intermitentes; lentidão; erros de programação (bugs) que não impeçam o uso do sistema ou para os quais exista forma alternativa de operação; atrasos pontuais nos prazos do item 4.3; indisponibilidades excluídas pelo item 4.2; insatisfação com funcionalidade existente; e pedido de funcionalidade não contratada.</w:t>
-      </w:r>
-    </w:p>
-    <w:p>
-      <w:pPr>
-        <w:spacing w:after="100" w:line="276"/>
-        <w:ind w:left="300"/>
-        <w:jc w:val="both"/>
-      </w:pPr>
-      <w:r>
-        <w:rPr>
-          <w:rFonts w:ascii="Calibri" w:cs="Calibri" w:eastAsia="Calibri" w:hAnsi="Calibri"/>
-          <w:sz w:val="22"/>
-          <w:szCs w:val="22"/>
-        </w:rPr>
-        <w:t xml:space="preserve">7.7. A rescisão por justa causa depende sempre de notificação escrita prévia, com o prazo de cura do item 7.1; sanada a irregularidade nesse prazo, fica afastada a justa causa e restabelecida a plena vigência do contrato.</w:t>
-      </w:r>
-    </w:p>
-    <w:p>
-      <w:pPr>
-        <w:spacing w:after="100" w:line="276"/>
+        <w:t xml:space="preserve">, isolada ou cumulativamente: falhas intermitentes; lentidão; erros de programação (bugs) que não impeçam o uso do sistema ou para os quais exista forma alternativa de operação; atrasos pontuais nos prazos do item 4.3; indisponibilidades excluídas pelos itens 4.2 e 4.2.1; insatisfação com funcionalidade existente; e pedido de funcionalidade não contratada.</w:t>
+      </w:r>
+    </w:p>
+    <w:p>
+      <w:pPr>
+        <w:spacing w:after="88" w:line="272"/>
+        <w:ind w:left="300"/>
+        <w:jc w:val="both"/>
+      </w:pPr>
+      <w:r>
+        <w:rPr>
+          <w:rFonts w:ascii="Calibri" w:cs="Calibri" w:eastAsia="Calibri" w:hAnsi="Calibri"/>
+          <w:sz w:val="22"/>
+          <w:szCs w:val="22"/>
+        </w:rPr>
+        <w:t xml:space="preserve">7.7. Ressalvada a hipótese do item 7.5, alínea "c", a rescisão por justa causa depende de notificação escrita prévia com o prazo de cura do item 7.1; sanada a irregularidade nesse prazo, fica afastada a justa causa e restabelecida a plena vigência do contrato.</w:t>
+      </w:r>
+    </w:p>
+    <w:p>
+      <w:pPr>
+        <w:spacing w:after="88" w:line="272"/>
         <w:ind w:left="300"/>
         <w:jc w:val="both"/>
       </w:pPr>
@@ -1564,31 +2158,67 @@
           <w:sz w:val="22"/>
           <w:szCs w:val="22"/>
         </w:rPr>
-        <w:t xml:space="preserve"> Encerrado o contrato por qualquer motivo, a CONTRATADA disponibilizará, em até 15 (quinze) dias, a exportação integral dos dados do condomínio em PDF, Excel ou CSV, mantendo-os disponíveis para resgate por 30 (trinta) dias. Decorrido esse prazo, </w:t>
-      </w:r>
-      <w:r>
-        <w:rPr>
-          <w:rFonts w:ascii="Calibri" w:cs="Calibri" w:eastAsia="Calibri" w:hAnsi="Calibri"/>
-          <w:b/>
-          <w:bCs/>
-          <w:sz w:val="22"/>
-          <w:szCs w:val="22"/>
-        </w:rPr>
-        <w:t xml:space="preserve">eliminará definitivamente</w:t>
-      </w:r>
-      <w:r>
-        <w:rPr>
-          <w:rFonts w:ascii="Calibri" w:cs="Calibri" w:eastAsia="Calibri" w:hAnsi="Calibri"/>
-          <w:sz w:val="22"/>
-          <w:szCs w:val="22"/>
-        </w:rPr>
-        <w:t xml:space="preserve"> os dados pessoais de suas bases, inclusive das cópias de segurança na primeira rotina de expurgo, ressalvados os de retenção legal obrigatória, e fornecerá declaração de eliminação se solicitada. Cabe à CONTRATANTE resgatar, nesse prazo, os documentos que a lei a obrigue a guardar, especialmente os relativos à prestação de contas. Com o término cessa a licença do item 1.5, devendo a CONTRATANTE e seus usuários interromper o acesso ao sistema. A rescisão não exonera a CONTRATANTE dos valores devidos até a efetiva interrupção dos serviços.</w:t>
+        <w:t xml:space="preserve"> Encerrado o contrato por qualquer motivo, a CONTRATADA disponibilizará, em até 15 (quinze) dias, a exportação integral dos dados do condomínio nos formatos e com o conteúdo descritos no Anexo II, mantendo-os disponíveis para resgate por 30 (trinta) dias. Decorrido esse prazo, </w:t>
+      </w:r>
+      <w:r>
+        <w:rPr>
+          <w:rFonts w:ascii="Calibri" w:cs="Calibri" w:eastAsia="Calibri" w:hAnsi="Calibri"/>
+          <w:b/>
+          <w:bCs/>
+          <w:sz w:val="22"/>
+          <w:szCs w:val="22"/>
+        </w:rPr>
+        <w:t xml:space="preserve">eliminará os dados pessoais das bases de produção em até 30 (trinta) dias e das cópias de segurança no ciclo técnico subsequente, que não excederá 90 (noventa) dias</w:t>
+      </w:r>
+      <w:r>
+        <w:rPr>
+          <w:rFonts w:ascii="Calibri" w:cs="Calibri" w:eastAsia="Calibri" w:hAnsi="Calibri"/>
+          <w:sz w:val="22"/>
+          <w:szCs w:val="22"/>
+        </w:rPr>
+        <w:t xml:space="preserve">, ressalvados os de retenção legal obrigatória e os necessários à defesa de direitos em processo, e fornecerá </w:t>
+      </w:r>
+      <w:r>
+        <w:rPr>
+          <w:rFonts w:ascii="Calibri" w:cs="Calibri" w:eastAsia="Calibri" w:hAnsi="Calibri"/>
+          <w:b/>
+          <w:bCs/>
+          <w:sz w:val="22"/>
+          <w:szCs w:val="22"/>
+        </w:rPr>
+        <w:t xml:space="preserve">certificado de eliminação</w:t>
+      </w:r>
+      <w:r>
+        <w:rPr>
+          <w:rFonts w:ascii="Calibri" w:cs="Calibri" w:eastAsia="Calibri" w:hAnsi="Calibri"/>
+          <w:sz w:val="22"/>
+          <w:szCs w:val="22"/>
+        </w:rPr>
+        <w:t xml:space="preserve">. Cabe à CONTRATANTE resgatar, nesse prazo, os documentos que a lei a obrigue a guardar, especialmente os relativos à prestação de contas. Com o término cessa a licença do item 1.5, devendo a CONTRATANTE e seus usuários interromper o acesso ao sistema. A rescisão não exonera a CONTRATANTE dos valores devidos até a efetiva interrupção dos serviços, e os deveres de sigilo e segurança da informação </w:t>
+      </w:r>
+      <w:r>
+        <w:rPr>
+          <w:rFonts w:ascii="Calibri" w:cs="Calibri" w:eastAsia="Calibri" w:hAnsi="Calibri"/>
+          <w:b/>
+          <w:bCs/>
+          <w:sz w:val="22"/>
+          <w:szCs w:val="22"/>
+        </w:rPr>
+        <w:t xml:space="preserve">subsistem ao término do contrato</w:t>
+      </w:r>
+      <w:r>
+        <w:rPr>
+          <w:rFonts w:ascii="Calibri" w:cs="Calibri" w:eastAsia="Calibri" w:hAnsi="Calibri"/>
+          <w:sz w:val="22"/>
+          <w:szCs w:val="22"/>
+        </w:rPr>
+        <w:t xml:space="preserve">.</w:t>
       </w:r>
     </w:p>
     <w:p>
       <w:pPr>
         <w:keepNext/>
-        <w:spacing w:after="110" w:before="240" w:line="276"/>
+        <w:spacing w:after="96" w:before="215" w:line="272"/>
       </w:pPr>
       <w:r>
         <w:rPr>
@@ -1604,7 +2234,7 @@
     </w:p>
     <w:p>
       <w:pPr>
-        <w:spacing w:after="100" w:line="276"/>
+        <w:spacing w:after="88" w:line="272"/>
         <w:ind w:left="300"/>
         <w:jc w:val="both"/>
       </w:pPr>
@@ -1619,7 +2249,7 @@
     </w:p>
     <w:p>
       <w:pPr>
-        <w:spacing w:after="100" w:line="276"/>
+        <w:spacing w:after="88" w:line="272"/>
         <w:ind w:left="300"/>
         <w:jc w:val="both"/>
       </w:pPr>
@@ -1639,6 +2269,39 @@
           <w:sz w:val="22"/>
           <w:szCs w:val="22"/>
         </w:rPr>
+        <w:t xml:space="preserve">Poderes do síndico.</w:t>
+      </w:r>
+      <w:r>
+        <w:rPr>
+          <w:rFonts w:ascii="Calibri" w:cs="Calibri" w:eastAsia="Calibri" w:hAnsi="Calibri"/>
+          <w:sz w:val="22"/>
+          <w:szCs w:val="22"/>
+        </w:rPr>
+        <w:t xml:space="preserve"> O(A) síndico(a) signatário(a) declara estar no exercício regular do mandato e possuir poderes para firmar este contrato, tendo obtido, quando exigida pela Convenção do condomínio, a prévia autorização da assembleia.</w:t>
+      </w:r>
+    </w:p>
+    <w:p>
+      <w:pPr>
+        <w:spacing w:after="88" w:line="272"/>
+        <w:ind w:left="300"/>
+        <w:jc w:val="both"/>
+      </w:pPr>
+      <w:r>
+        <w:rPr>
+          <w:rFonts w:ascii="Calibri" w:cs="Calibri" w:eastAsia="Calibri" w:hAnsi="Calibri"/>
+          <w:sz w:val="22"/>
+          <w:szCs w:val="22"/>
+        </w:rPr>
+        <w:t xml:space="preserve">8.3. </w:t>
+      </w:r>
+      <w:r>
+        <w:rPr>
+          <w:rFonts w:ascii="Calibri" w:cs="Calibri" w:eastAsia="Calibri" w:hAnsi="Calibri"/>
+          <w:b/>
+          <w:bCs/>
+          <w:sz w:val="22"/>
+          <w:szCs w:val="22"/>
+        </w:rPr>
         <w:t xml:space="preserve">Continuidade.</w:t>
       </w:r>
       <w:r>
@@ -1652,17 +2315,17 @@
     </w:p>
     <w:p>
       <w:pPr>
-        <w:spacing w:after="100" w:line="276"/>
-        <w:ind w:left="300"/>
-        <w:jc w:val="both"/>
-      </w:pPr>
-      <w:r>
-        <w:rPr>
-          <w:rFonts w:ascii="Calibri" w:cs="Calibri" w:eastAsia="Calibri" w:hAnsi="Calibri"/>
-          <w:sz w:val="22"/>
-          <w:szCs w:val="22"/>
-        </w:rPr>
-        <w:t xml:space="preserve">8.3. </w:t>
+        <w:spacing w:after="88" w:line="272"/>
+        <w:ind w:left="300"/>
+        <w:jc w:val="both"/>
+      </w:pPr>
+      <w:r>
+        <w:rPr>
+          <w:rFonts w:ascii="Calibri" w:cs="Calibri" w:eastAsia="Calibri" w:hAnsi="Calibri"/>
+          <w:sz w:val="22"/>
+          <w:szCs w:val="22"/>
+        </w:rPr>
+        <w:t xml:space="preserve">8.4. </w:t>
       </w:r>
       <w:r>
         <w:rPr>
@@ -1680,43 +2343,61 @@
           <w:sz w:val="22"/>
           <w:szCs w:val="22"/>
         </w:rPr>
-        <w:t xml:space="preserve"> As partes reconhecem a validade e a eficácia da assinatura eletrônica deste instrumento e de seus aditivos, nos termos da MP nº 2.200-2/2001 e da Lei nº 14.063/2020, ainda que realizada por plataforma que não utilize certificado ICP-Brasil.</w:t>
-      </w:r>
-    </w:p>
-    <w:p>
-      <w:pPr>
-        <w:spacing w:after="100" w:line="276"/>
-        <w:ind w:left="300"/>
-        <w:jc w:val="both"/>
-      </w:pPr>
-      <w:r>
-        <w:rPr>
-          <w:rFonts w:ascii="Calibri" w:cs="Calibri" w:eastAsia="Calibri" w:hAnsi="Calibri"/>
-          <w:sz w:val="22"/>
-          <w:szCs w:val="22"/>
-        </w:rPr>
-        <w:t xml:space="preserve">8.4. A tolerância quanto ao descumprimento de qualquer obrigação não implica novação ou renúncia de direitos; alterações somente valem se feitas por escrito e assinadas por ambas as partes; e a eventual nulidade de uma cláusula não afeta a validade das demais.</w:t>
-      </w:r>
-    </w:p>
-    <w:p>
-      <w:pPr>
-        <w:spacing w:after="100" w:line="276"/>
-        <w:ind w:left="300"/>
-        <w:jc w:val="both"/>
-      </w:pPr>
-      <w:r>
-        <w:rPr>
-          <w:rFonts w:ascii="Calibri" w:cs="Calibri" w:eastAsia="Calibri" w:hAnsi="Calibri"/>
-          <w:sz w:val="22"/>
-          <w:szCs w:val="22"/>
-        </w:rPr>
-        <w:t xml:space="preserve">8.5. Este contrato e seu Anexo I constituem o acordo integral entre as partes quanto ao seu objeto.</w:t>
+        <w:t xml:space="preserve"> As partes </w:t>
+      </w:r>
+      <w:r>
+        <w:rPr>
+          <w:rFonts w:ascii="Calibri" w:cs="Calibri" w:eastAsia="Calibri" w:hAnsi="Calibri"/>
+          <w:b/>
+          <w:bCs/>
+          <w:sz w:val="22"/>
+          <w:szCs w:val="22"/>
+        </w:rPr>
+        <w:t xml:space="preserve">declaram aceitar como válida entre si</w:t>
+      </w:r>
+      <w:r>
+        <w:rPr>
+          <w:rFonts w:ascii="Calibri" w:cs="Calibri" w:eastAsia="Calibri" w:hAnsi="Calibri"/>
+          <w:sz w:val="22"/>
+          <w:szCs w:val="22"/>
+        </w:rPr>
+        <w:t xml:space="preserve">, para os fins do art. 10, § 2º, da Medida Provisória nº 2.200-2/2001 e do art. 107 do Código Civil, a assinatura eletrônica deste instrumento e de seus aditivos por meio diverso do certificado ICP-Brasil, desde que a plataforma utilizada permita comprovar autoria e integridade, registrando identificação da plataforma, data e hora, e-mail e telefone dos signatários e endereço IP, quando disponível. As partes renunciam a impugnar a autenticidade do documento com fundamento exclusivo no meio de assinatura empregado.</w:t>
+      </w:r>
+    </w:p>
+    <w:p>
+      <w:pPr>
+        <w:spacing w:after="88" w:line="272"/>
+        <w:ind w:left="300"/>
+        <w:jc w:val="both"/>
+      </w:pPr>
+      <w:r>
+        <w:rPr>
+          <w:rFonts w:ascii="Calibri" w:cs="Calibri" w:eastAsia="Calibri" w:hAnsi="Calibri"/>
+          <w:sz w:val="22"/>
+          <w:szCs w:val="22"/>
+        </w:rPr>
+        <w:t xml:space="preserve">8.5. A tolerância quanto ao descumprimento de qualquer obrigação não implica novação ou renúncia de direitos; alterações somente valem se feitas por escrito e assinadas por ambas as partes; e a eventual nulidade de uma cláusula não afeta a validade das demais.</w:t>
+      </w:r>
+    </w:p>
+    <w:p>
+      <w:pPr>
+        <w:spacing w:after="88" w:line="272"/>
+        <w:ind w:left="300"/>
+        <w:jc w:val="both"/>
+      </w:pPr>
+      <w:r>
+        <w:rPr>
+          <w:rFonts w:ascii="Calibri" w:cs="Calibri" w:eastAsia="Calibri" w:hAnsi="Calibri"/>
+          <w:sz w:val="22"/>
+          <w:szCs w:val="22"/>
+        </w:rPr>
+        <w:t xml:space="preserve">8.6. Este contrato e seus Anexos I e II constituem o acordo integral entre as partes quanto ao seu objeto.</w:t>
       </w:r>
     </w:p>
     <w:p>
       <w:pPr>
         <w:keepNext/>
-        <w:spacing w:after="110" w:before="240" w:line="276"/>
+        <w:spacing w:after="96" w:before="215" w:line="272"/>
       </w:pPr>
       <w:r>
         <w:rPr>
@@ -1732,35 +2413,53 @@
     </w:p>
     <w:p>
       <w:pPr>
-        <w:spacing w:after="110" w:line="276"/>
-        <w:jc w:val="both"/>
-      </w:pPr>
-      <w:r>
-        <w:rPr>
-          <w:rFonts w:ascii="Calibri" w:cs="Calibri" w:eastAsia="Calibri" w:hAnsi="Calibri"/>
-          <w:sz w:val="22"/>
-          <w:szCs w:val="22"/>
-        </w:rPr>
-        <w:t xml:space="preserve">Fica eleito o foro da Comarca de Catanduva, Estado de São Paulo, para dirimir as controvérsias oriundas deste contrato, com renúncia expressa a qualquer outro, por mais privilegiado que seja.</w:t>
-      </w:r>
-    </w:p>
-    <w:p>
-      <w:pPr>
-        <w:spacing w:after="110" w:line="276"/>
-        <w:jc w:val="both"/>
-      </w:pPr>
-      <w:r>
-        <w:rPr>
-          <w:rFonts w:ascii="Calibri" w:cs="Calibri" w:eastAsia="Calibri" w:hAnsi="Calibri"/>
-          <w:sz w:val="22"/>
-          <w:szCs w:val="22"/>
-        </w:rPr>
-        <w:t xml:space="preserve">E, por estarem assim justas e contratadas, as partes assinam o presente instrumento em 02 (duas) vias de igual teor e forma, na presença das testemunhas abaixo assinadas.</w:t>
-      </w:r>
-    </w:p>
-    <w:p>
-      <w:pPr>
-        <w:spacing w:after="110" w:line="276"/>
+        <w:spacing w:after="96" w:line="272"/>
+        <w:jc w:val="both"/>
+      </w:pPr>
+      <w:r>
+        <w:rPr>
+          <w:rFonts w:ascii="Calibri" w:cs="Calibri" w:eastAsia="Calibri" w:hAnsi="Calibri"/>
+          <w:sz w:val="22"/>
+          <w:szCs w:val="22"/>
+        </w:rPr>
+        <w:t xml:space="preserve">Fica eleito o foro da Comarca de Catanduva, Estado de São Paulo, para dirimir as controvérsias oriundas deste contrato, </w:t>
+      </w:r>
+      <w:r>
+        <w:rPr>
+          <w:rFonts w:ascii="Calibri" w:cs="Calibri" w:eastAsia="Calibri" w:hAnsi="Calibri"/>
+          <w:b/>
+          <w:bCs/>
+          <w:sz w:val="22"/>
+          <w:szCs w:val="22"/>
+        </w:rPr>
+        <w:t xml:space="preserve">ressalvado o foro do domicílio da CONTRATANTE quando incidente norma cogente que o assegure</w:t>
+      </w:r>
+      <w:r>
+        <w:rPr>
+          <w:rFonts w:ascii="Calibri" w:cs="Calibri" w:eastAsia="Calibri" w:hAnsi="Calibri"/>
+          <w:sz w:val="22"/>
+          <w:szCs w:val="22"/>
+        </w:rPr>
+        <w:t xml:space="preserve">.</w:t>
+      </w:r>
+    </w:p>
+    <w:p>
+      <w:pPr>
+        <w:spacing w:after="96" w:line="272"/>
+        <w:jc w:val="both"/>
+      </w:pPr>
+      <w:r>
+        <w:rPr>
+          <w:rFonts w:ascii="Calibri" w:cs="Calibri" w:eastAsia="Calibri" w:hAnsi="Calibri"/>
+          <w:sz w:val="22"/>
+          <w:szCs w:val="22"/>
+        </w:rPr>
+        <w:t xml:space="preserve">E, por estarem assim justas e contratadas, as partes assinam o presente instrumento, com seus Anexos I e II, em 02 (duas) vias de igual teor e forma, na presença das testemunhas abaixo assinadas.</w:t>
+      </w:r>
+    </w:p>
+    <w:p>
+      <w:pPr>
+        <w:spacing w:after="96" w:line="272"/>
         <w:jc w:val="both"/>
       </w:pPr>
       <w:r>
@@ -1775,7 +2474,7 @@
     <w:p>
       <w:pPr>
         <w:keepNext/>
-        <w:spacing w:after="140" w:before="200"/>
+        <w:spacing w:after="120" w:before="150"/>
         <w:jc w:val="center"/>
       </w:pPr>
       <w:r>
@@ -1968,7 +2667,7 @@
     </w:tbl>
     <w:p>
       <w:pPr>
-        <w:spacing w:before="180"/>
+        <w:spacing w:before="150"/>
       </w:pPr>
     </w:p>
     <w:tbl>
@@ -2087,7 +2786,7 @@
     </w:tbl>
     <w:p>
       <w:pPr>
-        <w:spacing w:before="140"/>
+        <w:spacing w:before="110"/>
       </w:pPr>
     </w:p>
     <w:tbl>
@@ -2261,6 +2960,2019 @@
                 <w:szCs w:val="18"/>
               </w:rPr>
               <w:t xml:space="preserve">CPF:</w:t>
+            </w:r>
+          </w:p>
+        </w:tc>
+      </w:tr>
+    </w:tbl>
+    <w:p>
+      <w:r>
+        <w:br w:type="page"/>
+      </w:r>
+    </w:p>
+    <w:p>
+      <w:pPr>
+        <w:spacing w:after="60"/>
+        <w:jc w:val="center"/>
+      </w:pPr>
+      <w:r>
+        <w:rPr>
+          <w:rFonts w:ascii="Calibri" w:cs="Calibri" w:eastAsia="Calibri" w:hAnsi="Calibri"/>
+          <w:b/>
+          <w:bCs/>
+          <w:color w:val="083F5E"/>
+          <w:sz w:val="26"/>
+          <w:szCs w:val="26"/>
+        </w:rPr>
+        <w:t xml:space="preserve">ANEXO II</w:t>
+      </w:r>
+    </w:p>
+    <w:p>
+      <w:pPr>
+        <w:spacing w:after="40"/>
+        <w:jc w:val="center"/>
+      </w:pPr>
+      <w:r>
+        <w:rPr>
+          <w:rFonts w:ascii="Calibri" w:cs="Calibri" w:eastAsia="Calibri" w:hAnsi="Calibri"/>
+          <w:b/>
+          <w:bCs/>
+          <w:color w:val="083F5E"/>
+          <w:sz w:val="24"/>
+          <w:szCs w:val="24"/>
+        </w:rPr>
+        <w:t xml:space="preserve">ANEXO TÉCNICO E DE PROTEÇÃO DE DADOS</w:t>
+      </w:r>
+    </w:p>
+    <w:p>
+      <w:pPr>
+        <w:spacing w:after="240"/>
+        <w:jc w:val="center"/>
+      </w:pPr>
+      <w:r>
+        <w:rPr>
+          <w:rFonts w:ascii="Calibri" w:cs="Calibri" w:eastAsia="Calibri" w:hAnsi="Calibri"/>
+          <w:i/>
+          <w:iCs/>
+          <w:color w:val="5C6E8C"/>
+          <w:sz w:val="18"/>
+          <w:szCs w:val="18"/>
+        </w:rPr>
+        <w:t xml:space="preserve">Parte integrante do Contrato de Licença de Uso de Software e de Prestação de Serviços de Suporte</w:t>
+      </w:r>
+    </w:p>
+    <w:p>
+      <w:pPr>
+        <w:keepNext/>
+        <w:spacing w:after="90" w:before="200" w:line="276"/>
+      </w:pPr>
+      <w:r>
+        <w:rPr>
+          <w:rFonts w:ascii="Calibri" w:cs="Calibri" w:eastAsia="Calibri" w:hAnsi="Calibri"/>
+          <w:b/>
+          <w:bCs/>
+          <w:color w:val="083F5E"/>
+          <w:sz w:val="21"/>
+          <w:szCs w:val="21"/>
+        </w:rPr>
+        <w:t xml:space="preserve">1. MATRIZ DE RESPONSABILIDADES (LGPD)</w:t>
+      </w:r>
+    </w:p>
+    <w:p>
+      <w:pPr>
+        <w:spacing w:after="96" w:line="272"/>
+        <w:jc w:val="both"/>
+      </w:pPr>
+      <w:r>
+        <w:rPr>
+          <w:rFonts w:ascii="Calibri" w:cs="Calibri" w:eastAsia="Calibri" w:hAnsi="Calibri"/>
+          <w:sz w:val="22"/>
+          <w:szCs w:val="22"/>
+        </w:rPr>
+        <w:t xml:space="preserve">Repartição das decisões entre a CONTRATANTE (controladora) e a CONTRATADA (operadora), para os fins do item 6.1 do contrato:</w:t>
+      </w:r>
+    </w:p>
+    <w:tbl>
+      <w:tblPr>
+        <w:tblW w:type="dxa" w:w="9106"/>
+        <w:tblBorders>
+          <w:top w:val="single" w:color="C9D2E0" w:sz="2"/>
+          <w:left w:val="single" w:color="C9D2E0" w:sz="2"/>
+          <w:bottom w:val="single" w:color="C9D2E0" w:sz="2"/>
+          <w:right w:val="single" w:color="C9D2E0" w:sz="2"/>
+          <w:insideH w:val="single" w:color="C9D2E0" w:sz="2"/>
+          <w:insideV w:val="single" w:color="C9D2E0" w:sz="2"/>
+        </w:tblBorders>
+      </w:tblPr>
+      <w:tblGrid>
+        <w:gridCol w:w="3150"/>
+        <w:gridCol w:w="2550"/>
+        <w:gridCol w:w="3406"/>
+      </w:tblGrid>
+      <w:tr>
+        <w:trPr>
+          <w:cantSplit/>
+          <w:tblHeader/>
+        </w:trPr>
+        <w:tc>
+          <w:tcPr>
+            <w:tcW w:type="dxa" w:w="3150"/>
+            <w:shd w:fill="083F5E" w:color="auto" w:val="clear"/>
+            <w:tcMar>
+              <w:top w:type="dxa" w:w="60"/>
+              <w:left w:type="dxa" w:w="100"/>
+              <w:bottom w:type="dxa" w:w="60"/>
+              <w:right w:type="dxa" w:w="100"/>
+            </w:tcMar>
+          </w:tcPr>
+          <w:p>
+            <w:pPr>
+              <w:spacing w:after="40" w:before="40" w:line="250"/>
+            </w:pPr>
+            <w:r>
+              <w:rPr>
+                <w:rFonts w:ascii="Calibri" w:cs="Calibri" w:eastAsia="Calibri" w:hAnsi="Calibri"/>
+                <w:b/>
+                <w:bCs/>
+                <w:color w:val="FFFFFF"/>
+                <w:sz w:val="18"/>
+                <w:szCs w:val="18"/>
+              </w:rPr>
+              <w:t xml:space="preserve">Decisão ou atividade</w:t>
+            </w:r>
+          </w:p>
+        </w:tc>
+        <w:tc>
+          <w:tcPr>
+            <w:tcW w:type="dxa" w:w="2550"/>
+            <w:shd w:fill="083F5E" w:color="auto" w:val="clear"/>
+            <w:tcMar>
+              <w:top w:type="dxa" w:w="60"/>
+              <w:left w:type="dxa" w:w="100"/>
+              <w:bottom w:type="dxa" w:w="60"/>
+              <w:right w:type="dxa" w:w="100"/>
+            </w:tcMar>
+          </w:tcPr>
+          <w:p>
+            <w:pPr>
+              <w:spacing w:after="40" w:before="40" w:line="250"/>
+            </w:pPr>
+            <w:r>
+              <w:rPr>
+                <w:rFonts w:ascii="Calibri" w:cs="Calibri" w:eastAsia="Calibri" w:hAnsi="Calibri"/>
+                <w:b/>
+                <w:bCs/>
+                <w:color w:val="FFFFFF"/>
+                <w:sz w:val="18"/>
+                <w:szCs w:val="18"/>
+              </w:rPr>
+              <w:t xml:space="preserve">Responsável</w:t>
+            </w:r>
+          </w:p>
+        </w:tc>
+        <w:tc>
+          <w:tcPr>
+            <w:tcW w:type="dxa" w:w="3406"/>
+            <w:shd w:fill="083F5E" w:color="auto" w:val="clear"/>
+            <w:tcMar>
+              <w:top w:type="dxa" w:w="60"/>
+              <w:left w:type="dxa" w:w="100"/>
+              <w:bottom w:type="dxa" w:w="60"/>
+              <w:right w:type="dxa" w:w="100"/>
+            </w:tcMar>
+          </w:tcPr>
+          <w:p>
+            <w:pPr>
+              <w:spacing w:after="40" w:before="40" w:line="250"/>
+            </w:pPr>
+            <w:r>
+              <w:rPr>
+                <w:rFonts w:ascii="Calibri" w:cs="Calibri" w:eastAsia="Calibri" w:hAnsi="Calibri"/>
+                <w:b/>
+                <w:bCs/>
+                <w:color w:val="FFFFFF"/>
+                <w:sz w:val="18"/>
+                <w:szCs w:val="18"/>
+              </w:rPr>
+              <w:t xml:space="preserve">Observação</w:t>
+            </w:r>
+          </w:p>
+        </w:tc>
+      </w:tr>
+      <w:tr>
+        <w:trPr>
+          <w:cantSplit/>
+          <w:tblHeader w:val="false"/>
+        </w:trPr>
+        <w:tc>
+          <w:tcPr>
+            <w:tcW w:type="dxa" w:w="3150"/>
+            <w:tcMar>
+              <w:top w:type="dxa" w:w="60"/>
+              <w:left w:type="dxa" w:w="100"/>
+              <w:bottom w:type="dxa" w:w="60"/>
+              <w:right w:type="dxa" w:w="100"/>
+            </w:tcMar>
+          </w:tcPr>
+          <w:p>
+            <w:pPr>
+              <w:spacing w:after="40" w:before="40" w:line="250"/>
+            </w:pPr>
+            <w:r>
+              <w:rPr>
+                <w:rFonts w:ascii="Calibri" w:cs="Calibri" w:eastAsia="Calibri" w:hAnsi="Calibri"/>
+                <w:b w:val="false"/>
+                <w:bCs w:val="false"/>
+                <w:color w:val="000000"/>
+                <w:sz w:val="18"/>
+                <w:szCs w:val="18"/>
+              </w:rPr>
+              <w:t xml:space="preserve">Quais dados pessoais são coletados e quais módulos são ativados</w:t>
+            </w:r>
+          </w:p>
+        </w:tc>
+        <w:tc>
+          <w:tcPr>
+            <w:tcW w:type="dxa" w:w="2550"/>
+            <w:tcMar>
+              <w:top w:type="dxa" w:w="60"/>
+              <w:left w:type="dxa" w:w="100"/>
+              <w:bottom w:type="dxa" w:w="60"/>
+              <w:right w:type="dxa" w:w="100"/>
+            </w:tcMar>
+          </w:tcPr>
+          <w:p>
+            <w:pPr>
+              <w:spacing w:after="40" w:before="40" w:line="250"/>
+            </w:pPr>
+            <w:r>
+              <w:rPr>
+                <w:rFonts w:ascii="Calibri" w:cs="Calibri" w:eastAsia="Calibri" w:hAnsi="Calibri"/>
+                <w:b w:val="false"/>
+                <w:bCs w:val="false"/>
+                <w:color w:val="000000"/>
+                <w:sz w:val="18"/>
+                <w:szCs w:val="18"/>
+              </w:rPr>
+              <w:t xml:space="preserve">CONTRATANTE</w:t>
+            </w:r>
+          </w:p>
+        </w:tc>
+        <w:tc>
+          <w:tcPr>
+            <w:tcW w:type="dxa" w:w="3406"/>
+            <w:tcMar>
+              <w:top w:type="dxa" w:w="60"/>
+              <w:left w:type="dxa" w:w="100"/>
+              <w:bottom w:type="dxa" w:w="60"/>
+              <w:right w:type="dxa" w:w="100"/>
+            </w:tcMar>
+          </w:tcPr>
+          <w:p>
+            <w:pPr>
+              <w:spacing w:after="40" w:before="40" w:line="250"/>
+            </w:pPr>
+            <w:r>
+              <w:rPr>
+                <w:rFonts w:ascii="Calibri" w:cs="Calibri" w:eastAsia="Calibri" w:hAnsi="Calibri"/>
+                <w:b w:val="false"/>
+                <w:bCs w:val="false"/>
+                <w:color w:val="000000"/>
+                <w:sz w:val="18"/>
+                <w:szCs w:val="18"/>
+              </w:rPr>
+              <w:t xml:space="preserve">A CONTRATADA disponibiliza os módulos; a ativação é decisão do condomínio.</w:t>
+            </w:r>
+          </w:p>
+        </w:tc>
+      </w:tr>
+      <w:tr>
+        <w:trPr>
+          <w:cantSplit/>
+          <w:tblHeader w:val="false"/>
+        </w:trPr>
+        <w:tc>
+          <w:tcPr>
+            <w:tcW w:type="dxa" w:w="3150"/>
+            <w:tcMar>
+              <w:top w:type="dxa" w:w="60"/>
+              <w:left w:type="dxa" w:w="100"/>
+              <w:bottom w:type="dxa" w:w="60"/>
+              <w:right w:type="dxa" w:w="100"/>
+            </w:tcMar>
+          </w:tcPr>
+          <w:p>
+            <w:pPr>
+              <w:spacing w:after="40" w:before="40" w:line="250"/>
+            </w:pPr>
+            <w:r>
+              <w:rPr>
+                <w:rFonts w:ascii="Calibri" w:cs="Calibri" w:eastAsia="Calibri" w:hAnsi="Calibri"/>
+                <w:b w:val="false"/>
+                <w:bCs w:val="false"/>
+                <w:color w:val="000000"/>
+                <w:sz w:val="18"/>
+                <w:szCs w:val="18"/>
+              </w:rPr>
+              <w:t xml:space="preserve">Base legal do tratamento, inclusive da biometria</w:t>
+            </w:r>
+          </w:p>
+        </w:tc>
+        <w:tc>
+          <w:tcPr>
+            <w:tcW w:type="dxa" w:w="2550"/>
+            <w:tcMar>
+              <w:top w:type="dxa" w:w="60"/>
+              <w:left w:type="dxa" w:w="100"/>
+              <w:bottom w:type="dxa" w:w="60"/>
+              <w:right w:type="dxa" w:w="100"/>
+            </w:tcMar>
+          </w:tcPr>
+          <w:p>
+            <w:pPr>
+              <w:spacing w:after="40" w:before="40" w:line="250"/>
+            </w:pPr>
+            <w:r>
+              <w:rPr>
+                <w:rFonts w:ascii="Calibri" w:cs="Calibri" w:eastAsia="Calibri" w:hAnsi="Calibri"/>
+                <w:b w:val="false"/>
+                <w:bCs w:val="false"/>
+                <w:color w:val="000000"/>
+                <w:sz w:val="18"/>
+                <w:szCs w:val="18"/>
+              </w:rPr>
+              <w:t xml:space="preserve">CONTRATANTE</w:t>
+            </w:r>
+          </w:p>
+        </w:tc>
+        <w:tc>
+          <w:tcPr>
+            <w:tcW w:type="dxa" w:w="3406"/>
+            <w:tcMar>
+              <w:top w:type="dxa" w:w="60"/>
+              <w:left w:type="dxa" w:w="100"/>
+              <w:bottom w:type="dxa" w:w="60"/>
+              <w:right w:type="dxa" w:w="100"/>
+            </w:tcMar>
+          </w:tcPr>
+          <w:p>
+            <w:pPr>
+              <w:spacing w:after="40" w:before="40" w:line="250"/>
+            </w:pPr>
+            <w:r>
+              <w:rPr>
+                <w:rFonts w:ascii="Calibri" w:cs="Calibri" w:eastAsia="Calibri" w:hAnsi="Calibri"/>
+                <w:b w:val="false"/>
+                <w:bCs w:val="false"/>
+                <w:color w:val="000000"/>
+                <w:sz w:val="18"/>
+                <w:szCs w:val="18"/>
+              </w:rPr>
+              <w:t xml:space="preserve">Com apoio informativo da CONTRATADA.</w:t>
+            </w:r>
+          </w:p>
+        </w:tc>
+      </w:tr>
+      <w:tr>
+        <w:trPr>
+          <w:cantSplit/>
+          <w:tblHeader w:val="false"/>
+        </w:trPr>
+        <w:tc>
+          <w:tcPr>
+            <w:tcW w:type="dxa" w:w="3150"/>
+            <w:tcMar>
+              <w:top w:type="dxa" w:w="60"/>
+              <w:left w:type="dxa" w:w="100"/>
+              <w:bottom w:type="dxa" w:w="60"/>
+              <w:right w:type="dxa" w:w="100"/>
+            </w:tcMar>
+          </w:tcPr>
+          <w:p>
+            <w:pPr>
+              <w:spacing w:after="40" w:before="40" w:line="250"/>
+            </w:pPr>
+            <w:r>
+              <w:rPr>
+                <w:rFonts w:ascii="Calibri" w:cs="Calibri" w:eastAsia="Calibri" w:hAnsi="Calibri"/>
+                <w:b w:val="false"/>
+                <w:bCs w:val="false"/>
+                <w:color w:val="000000"/>
+                <w:sz w:val="18"/>
+                <w:szCs w:val="18"/>
+              </w:rPr>
+              <w:t xml:space="preserve">Aviso de privacidade e informação aos titulares</w:t>
+            </w:r>
+          </w:p>
+        </w:tc>
+        <w:tc>
+          <w:tcPr>
+            <w:tcW w:type="dxa" w:w="2550"/>
+            <w:tcMar>
+              <w:top w:type="dxa" w:w="60"/>
+              <w:left w:type="dxa" w:w="100"/>
+              <w:bottom w:type="dxa" w:w="60"/>
+              <w:right w:type="dxa" w:w="100"/>
+            </w:tcMar>
+          </w:tcPr>
+          <w:p>
+            <w:pPr>
+              <w:spacing w:after="40" w:before="40" w:line="250"/>
+            </w:pPr>
+            <w:r>
+              <w:rPr>
+                <w:rFonts w:ascii="Calibri" w:cs="Calibri" w:eastAsia="Calibri" w:hAnsi="Calibri"/>
+                <w:b w:val="false"/>
+                <w:bCs w:val="false"/>
+                <w:color w:val="000000"/>
+                <w:sz w:val="18"/>
+                <w:szCs w:val="18"/>
+              </w:rPr>
+              <w:t xml:space="preserve">CONTRATANTE</w:t>
+            </w:r>
+          </w:p>
+        </w:tc>
+        <w:tc>
+          <w:tcPr>
+            <w:tcW w:type="dxa" w:w="3406"/>
+            <w:tcMar>
+              <w:top w:type="dxa" w:w="60"/>
+              <w:left w:type="dxa" w:w="100"/>
+              <w:bottom w:type="dxa" w:w="60"/>
+              <w:right w:type="dxa" w:w="100"/>
+            </w:tcMar>
+          </w:tcPr>
+          <w:p>
+            <w:pPr>
+              <w:spacing w:after="40" w:before="40" w:line="250"/>
+            </w:pPr>
+            <w:r>
+              <w:rPr>
+                <w:rFonts w:ascii="Calibri" w:cs="Calibri" w:eastAsia="Calibri" w:hAnsi="Calibri"/>
+                <w:b w:val="false"/>
+                <w:bCs w:val="false"/>
+                <w:color w:val="000000"/>
+                <w:sz w:val="18"/>
+                <w:szCs w:val="18"/>
+              </w:rPr>
+              <w:t xml:space="preserve">A CONTRATADA fornece modelo, quando solicitado.</w:t>
+            </w:r>
+          </w:p>
+        </w:tc>
+      </w:tr>
+      <w:tr>
+        <w:trPr>
+          <w:cantSplit/>
+          <w:tblHeader w:val="false"/>
+        </w:trPr>
+        <w:tc>
+          <w:tcPr>
+            <w:tcW w:type="dxa" w:w="3150"/>
+            <w:tcMar>
+              <w:top w:type="dxa" w:w="60"/>
+              <w:left w:type="dxa" w:w="100"/>
+              <w:bottom w:type="dxa" w:w="60"/>
+              <w:right w:type="dxa" w:w="100"/>
+            </w:tcMar>
+          </w:tcPr>
+          <w:p>
+            <w:pPr>
+              <w:spacing w:after="40" w:before="40" w:line="250"/>
+            </w:pPr>
+            <w:r>
+              <w:rPr>
+                <w:rFonts w:ascii="Calibri" w:cs="Calibri" w:eastAsia="Calibri" w:hAnsi="Calibri"/>
+                <w:b w:val="false"/>
+                <w:bCs w:val="false"/>
+                <w:color w:val="000000"/>
+                <w:sz w:val="18"/>
+                <w:szCs w:val="18"/>
+              </w:rPr>
+              <w:t xml:space="preserve">Coleta e guarda do consentimento, quando essa for a base</w:t>
+            </w:r>
+          </w:p>
+        </w:tc>
+        <w:tc>
+          <w:tcPr>
+            <w:tcW w:type="dxa" w:w="2550"/>
+            <w:tcMar>
+              <w:top w:type="dxa" w:w="60"/>
+              <w:left w:type="dxa" w:w="100"/>
+              <w:bottom w:type="dxa" w:w="60"/>
+              <w:right w:type="dxa" w:w="100"/>
+            </w:tcMar>
+          </w:tcPr>
+          <w:p>
+            <w:pPr>
+              <w:spacing w:after="40" w:before="40" w:line="250"/>
+            </w:pPr>
+            <w:r>
+              <w:rPr>
+                <w:rFonts w:ascii="Calibri" w:cs="Calibri" w:eastAsia="Calibri" w:hAnsi="Calibri"/>
+                <w:b w:val="false"/>
+                <w:bCs w:val="false"/>
+                <w:color w:val="000000"/>
+                <w:sz w:val="18"/>
+                <w:szCs w:val="18"/>
+              </w:rPr>
+              <w:t xml:space="preserve">CONTRATANTE</w:t>
+            </w:r>
+          </w:p>
+        </w:tc>
+        <w:tc>
+          <w:tcPr>
+            <w:tcW w:type="dxa" w:w="3406"/>
+            <w:tcMar>
+              <w:top w:type="dxa" w:w="60"/>
+              <w:left w:type="dxa" w:w="100"/>
+              <w:bottom w:type="dxa" w:w="60"/>
+              <w:right w:type="dxa" w:w="100"/>
+            </w:tcMar>
+          </w:tcPr>
+          <w:p>
+            <w:pPr>
+              <w:spacing w:after="40" w:before="40" w:line="250"/>
+            </w:pPr>
+            <w:r>
+              <w:rPr>
+                <w:rFonts w:ascii="Calibri" w:cs="Calibri" w:eastAsia="Calibri" w:hAnsi="Calibri"/>
+                <w:b w:val="false"/>
+                <w:bCs w:val="false"/>
+                <w:color w:val="000000"/>
+                <w:sz w:val="18"/>
+                <w:szCs w:val="18"/>
+              </w:rPr>
+              <w:t xml:space="preserve">Documentação arquivada pelo condomínio.</w:t>
+            </w:r>
+          </w:p>
+        </w:tc>
+      </w:tr>
+      <w:tr>
+        <w:trPr>
+          <w:cantSplit/>
+          <w:tblHeader w:val="false"/>
+        </w:trPr>
+        <w:tc>
+          <w:tcPr>
+            <w:tcW w:type="dxa" w:w="3150"/>
+            <w:tcMar>
+              <w:top w:type="dxa" w:w="60"/>
+              <w:left w:type="dxa" w:w="100"/>
+              <w:bottom w:type="dxa" w:w="60"/>
+              <w:right w:type="dxa" w:w="100"/>
+            </w:tcMar>
+          </w:tcPr>
+          <w:p>
+            <w:pPr>
+              <w:spacing w:after="40" w:before="40" w:line="250"/>
+            </w:pPr>
+            <w:r>
+              <w:rPr>
+                <w:rFonts w:ascii="Calibri" w:cs="Calibri" w:eastAsia="Calibri" w:hAnsi="Calibri"/>
+                <w:b w:val="false"/>
+                <w:bCs w:val="false"/>
+                <w:color w:val="000000"/>
+                <w:sz w:val="18"/>
+                <w:szCs w:val="18"/>
+              </w:rPr>
+              <w:t xml:space="preserve">Quem tem acesso ao sistema e com qual perfil</w:t>
+            </w:r>
+          </w:p>
+        </w:tc>
+        <w:tc>
+          <w:tcPr>
+            <w:tcW w:type="dxa" w:w="2550"/>
+            <w:tcMar>
+              <w:top w:type="dxa" w:w="60"/>
+              <w:left w:type="dxa" w:w="100"/>
+              <w:bottom w:type="dxa" w:w="60"/>
+              <w:right w:type="dxa" w:w="100"/>
+            </w:tcMar>
+          </w:tcPr>
+          <w:p>
+            <w:pPr>
+              <w:spacing w:after="40" w:before="40" w:line="250"/>
+            </w:pPr>
+            <w:r>
+              <w:rPr>
+                <w:rFonts w:ascii="Calibri" w:cs="Calibri" w:eastAsia="Calibri" w:hAnsi="Calibri"/>
+                <w:b w:val="false"/>
+                <w:bCs w:val="false"/>
+                <w:color w:val="000000"/>
+                <w:sz w:val="18"/>
+                <w:szCs w:val="18"/>
+              </w:rPr>
+              <w:t xml:space="preserve">CONTRATANTE</w:t>
+            </w:r>
+          </w:p>
+        </w:tc>
+        <w:tc>
+          <w:tcPr>
+            <w:tcW w:type="dxa" w:w="3406"/>
+            <w:tcMar>
+              <w:top w:type="dxa" w:w="60"/>
+              <w:left w:type="dxa" w:w="100"/>
+              <w:bottom w:type="dxa" w:w="60"/>
+              <w:right w:type="dxa" w:w="100"/>
+            </w:tcMar>
+          </w:tcPr>
+          <w:p>
+            <w:pPr>
+              <w:spacing w:after="40" w:before="40" w:line="250"/>
+            </w:pPr>
+            <w:r>
+              <w:rPr>
+                <w:rFonts w:ascii="Calibri" w:cs="Calibri" w:eastAsia="Calibri" w:hAnsi="Calibri"/>
+                <w:b w:val="false"/>
+                <w:bCs w:val="false"/>
+                <w:color w:val="000000"/>
+                <w:sz w:val="18"/>
+                <w:szCs w:val="18"/>
+              </w:rPr>
+              <w:t xml:space="preserve">Credenciais individuais, sem compartilhamento.</w:t>
+            </w:r>
+          </w:p>
+        </w:tc>
+      </w:tr>
+      <w:tr>
+        <w:trPr>
+          <w:cantSplit/>
+          <w:tblHeader w:val="false"/>
+        </w:trPr>
+        <w:tc>
+          <w:tcPr>
+            <w:tcW w:type="dxa" w:w="3150"/>
+            <w:tcMar>
+              <w:top w:type="dxa" w:w="60"/>
+              <w:left w:type="dxa" w:w="100"/>
+              <w:bottom w:type="dxa" w:w="60"/>
+              <w:right w:type="dxa" w:w="100"/>
+            </w:tcMar>
+          </w:tcPr>
+          <w:p>
+            <w:pPr>
+              <w:spacing w:after="40" w:before="40" w:line="250"/>
+            </w:pPr>
+            <w:r>
+              <w:rPr>
+                <w:rFonts w:ascii="Calibri" w:cs="Calibri" w:eastAsia="Calibri" w:hAnsi="Calibri"/>
+                <w:b w:val="false"/>
+                <w:bCs w:val="false"/>
+                <w:color w:val="000000"/>
+                <w:sz w:val="18"/>
+                <w:szCs w:val="18"/>
+              </w:rPr>
+              <w:t xml:space="preserve">Prazo de retenção dos dados</w:t>
+            </w:r>
+          </w:p>
+        </w:tc>
+        <w:tc>
+          <w:tcPr>
+            <w:tcW w:type="dxa" w:w="2550"/>
+            <w:tcMar>
+              <w:top w:type="dxa" w:w="60"/>
+              <w:left w:type="dxa" w:w="100"/>
+              <w:bottom w:type="dxa" w:w="60"/>
+              <w:right w:type="dxa" w:w="100"/>
+            </w:tcMar>
+          </w:tcPr>
+          <w:p>
+            <w:pPr>
+              <w:spacing w:after="40" w:before="40" w:line="250"/>
+            </w:pPr>
+            <w:r>
+              <w:rPr>
+                <w:rFonts w:ascii="Calibri" w:cs="Calibri" w:eastAsia="Calibri" w:hAnsi="Calibri"/>
+                <w:b w:val="false"/>
+                <w:bCs w:val="false"/>
+                <w:color w:val="000000"/>
+                <w:sz w:val="18"/>
+                <w:szCs w:val="18"/>
+              </w:rPr>
+              <w:t xml:space="preserve">CONTRATANTE define; CONTRATADA implementa</w:t>
+            </w:r>
+          </w:p>
+        </w:tc>
+        <w:tc>
+          <w:tcPr>
+            <w:tcW w:type="dxa" w:w="3406"/>
+            <w:tcMar>
+              <w:top w:type="dxa" w:w="60"/>
+              <w:left w:type="dxa" w:w="100"/>
+              <w:bottom w:type="dxa" w:w="60"/>
+              <w:right w:type="dxa" w:w="100"/>
+            </w:tcMar>
+          </w:tcPr>
+          <w:p>
+            <w:pPr>
+              <w:spacing w:after="40" w:before="40" w:line="250"/>
+            </w:pPr>
+            <w:r>
+              <w:rPr>
+                <w:rFonts w:ascii="Calibri" w:cs="Calibri" w:eastAsia="Calibri" w:hAnsi="Calibri"/>
+                <w:b w:val="false"/>
+                <w:bCs w:val="false"/>
+                <w:color w:val="000000"/>
+                <w:sz w:val="18"/>
+                <w:szCs w:val="18"/>
+              </w:rPr>
+              <w:t xml:space="preserve">Padrão do sistema: 24 meses, ajustável a pedido.</w:t>
+            </w:r>
+          </w:p>
+        </w:tc>
+      </w:tr>
+      <w:tr>
+        <w:trPr>
+          <w:cantSplit/>
+          <w:tblHeader w:val="false"/>
+        </w:trPr>
+        <w:tc>
+          <w:tcPr>
+            <w:tcW w:type="dxa" w:w="3150"/>
+            <w:tcMar>
+              <w:top w:type="dxa" w:w="60"/>
+              <w:left w:type="dxa" w:w="100"/>
+              <w:bottom w:type="dxa" w:w="60"/>
+              <w:right w:type="dxa" w:w="100"/>
+            </w:tcMar>
+          </w:tcPr>
+          <w:p>
+            <w:pPr>
+              <w:spacing w:after="40" w:before="40" w:line="250"/>
+            </w:pPr>
+            <w:r>
+              <w:rPr>
+                <w:rFonts w:ascii="Calibri" w:cs="Calibri" w:eastAsia="Calibri" w:hAnsi="Calibri"/>
+                <w:b w:val="false"/>
+                <w:bCs w:val="false"/>
+                <w:color w:val="000000"/>
+                <w:sz w:val="18"/>
+                <w:szCs w:val="18"/>
+              </w:rPr>
+              <w:t xml:space="preserve">Segurança da plataforma, criptografia e controle de acesso</w:t>
+            </w:r>
+          </w:p>
+        </w:tc>
+        <w:tc>
+          <w:tcPr>
+            <w:tcW w:type="dxa" w:w="2550"/>
+            <w:tcMar>
+              <w:top w:type="dxa" w:w="60"/>
+              <w:left w:type="dxa" w:w="100"/>
+              <w:bottom w:type="dxa" w:w="60"/>
+              <w:right w:type="dxa" w:w="100"/>
+            </w:tcMar>
+          </w:tcPr>
+          <w:p>
+            <w:pPr>
+              <w:spacing w:after="40" w:before="40" w:line="250"/>
+            </w:pPr>
+            <w:r>
+              <w:rPr>
+                <w:rFonts w:ascii="Calibri" w:cs="Calibri" w:eastAsia="Calibri" w:hAnsi="Calibri"/>
+                <w:b w:val="false"/>
+                <w:bCs w:val="false"/>
+                <w:color w:val="000000"/>
+                <w:sz w:val="18"/>
+                <w:szCs w:val="18"/>
+              </w:rPr>
+              <w:t xml:space="preserve">CONTRATADA</w:t>
+            </w:r>
+          </w:p>
+        </w:tc>
+        <w:tc>
+          <w:tcPr>
+            <w:tcW w:type="dxa" w:w="3406"/>
+            <w:tcMar>
+              <w:top w:type="dxa" w:w="60"/>
+              <w:left w:type="dxa" w:w="100"/>
+              <w:bottom w:type="dxa" w:w="60"/>
+              <w:right w:type="dxa" w:w="100"/>
+            </w:tcMar>
+          </w:tcPr>
+          <w:p>
+            <w:pPr>
+              <w:spacing w:after="40" w:before="40" w:line="250"/>
+            </w:pPr>
+            <w:r>
+              <w:rPr>
+                <w:rFonts w:ascii="Calibri" w:cs="Calibri" w:eastAsia="Calibri" w:hAnsi="Calibri"/>
+                <w:b w:val="false"/>
+                <w:bCs w:val="false"/>
+                <w:color w:val="000000"/>
+                <w:sz w:val="18"/>
+                <w:szCs w:val="18"/>
+              </w:rPr>
+              <w:t xml:space="preserve">Obrigação própria da operadora (item 6.1.1 do contrato).</w:t>
+            </w:r>
+          </w:p>
+        </w:tc>
+      </w:tr>
+      <w:tr>
+        <w:trPr>
+          <w:cantSplit/>
+          <w:tblHeader w:val="false"/>
+        </w:trPr>
+        <w:tc>
+          <w:tcPr>
+            <w:tcW w:type="dxa" w:w="3150"/>
+            <w:tcMar>
+              <w:top w:type="dxa" w:w="60"/>
+              <w:left w:type="dxa" w:w="100"/>
+              <w:bottom w:type="dxa" w:w="60"/>
+              <w:right w:type="dxa" w:w="100"/>
+            </w:tcMar>
+          </w:tcPr>
+          <w:p>
+            <w:pPr>
+              <w:spacing w:after="40" w:before="40" w:line="250"/>
+            </w:pPr>
+            <w:r>
+              <w:rPr>
+                <w:rFonts w:ascii="Calibri" w:cs="Calibri" w:eastAsia="Calibri" w:hAnsi="Calibri"/>
+                <w:b w:val="false"/>
+                <w:bCs w:val="false"/>
+                <w:color w:val="000000"/>
+                <w:sz w:val="18"/>
+                <w:szCs w:val="18"/>
+              </w:rPr>
+              <w:t xml:space="preserve">Geração, guarda e integridade dos logs</w:t>
+            </w:r>
+          </w:p>
+        </w:tc>
+        <w:tc>
+          <w:tcPr>
+            <w:tcW w:type="dxa" w:w="2550"/>
+            <w:tcMar>
+              <w:top w:type="dxa" w:w="60"/>
+              <w:left w:type="dxa" w:w="100"/>
+              <w:bottom w:type="dxa" w:w="60"/>
+              <w:right w:type="dxa" w:w="100"/>
+            </w:tcMar>
+          </w:tcPr>
+          <w:p>
+            <w:pPr>
+              <w:spacing w:after="40" w:before="40" w:line="250"/>
+            </w:pPr>
+            <w:r>
+              <w:rPr>
+                <w:rFonts w:ascii="Calibri" w:cs="Calibri" w:eastAsia="Calibri" w:hAnsi="Calibri"/>
+                <w:b w:val="false"/>
+                <w:bCs w:val="false"/>
+                <w:color w:val="000000"/>
+                <w:sz w:val="18"/>
+                <w:szCs w:val="18"/>
+              </w:rPr>
+              <w:t xml:space="preserve">CONTRATADA</w:t>
+            </w:r>
+          </w:p>
+        </w:tc>
+        <w:tc>
+          <w:tcPr>
+            <w:tcW w:type="dxa" w:w="3406"/>
+            <w:tcMar>
+              <w:top w:type="dxa" w:w="60"/>
+              <w:left w:type="dxa" w:w="100"/>
+              <w:bottom w:type="dxa" w:w="60"/>
+              <w:right w:type="dxa" w:w="100"/>
+            </w:tcMar>
+          </w:tcPr>
+          <w:p>
+            <w:pPr>
+              <w:spacing w:after="40" w:before="40" w:line="250"/>
+            </w:pPr>
+            <w:r>
+              <w:rPr>
+                <w:rFonts w:ascii="Calibri" w:cs="Calibri" w:eastAsia="Calibri" w:hAnsi="Calibri"/>
+                <w:b w:val="false"/>
+                <w:bCs w:val="false"/>
+                <w:color w:val="000000"/>
+                <w:sz w:val="18"/>
+                <w:szCs w:val="18"/>
+              </w:rPr>
+              <w:t xml:space="preserve">Retenção mínima de 6 meses (item 4 deste Anexo).</w:t>
+            </w:r>
+          </w:p>
+        </w:tc>
+      </w:tr>
+      <w:tr>
+        <w:trPr>
+          <w:cantSplit/>
+          <w:tblHeader w:val="false"/>
+        </w:trPr>
+        <w:tc>
+          <w:tcPr>
+            <w:tcW w:type="dxa" w:w="3150"/>
+            <w:tcMar>
+              <w:top w:type="dxa" w:w="60"/>
+              <w:left w:type="dxa" w:w="100"/>
+              <w:bottom w:type="dxa" w:w="60"/>
+              <w:right w:type="dxa" w:w="100"/>
+            </w:tcMar>
+          </w:tcPr>
+          <w:p>
+            <w:pPr>
+              <w:spacing w:after="40" w:before="40" w:line="250"/>
+            </w:pPr>
+            <w:r>
+              <w:rPr>
+                <w:rFonts w:ascii="Calibri" w:cs="Calibri" w:eastAsia="Calibri" w:hAnsi="Calibri"/>
+                <w:b w:val="false"/>
+                <w:bCs w:val="false"/>
+                <w:color w:val="000000"/>
+                <w:sz w:val="18"/>
+                <w:szCs w:val="18"/>
+              </w:rPr>
+              <w:t xml:space="preserve">Seleção e acompanhamento dos suboperadores</w:t>
+            </w:r>
+          </w:p>
+        </w:tc>
+        <w:tc>
+          <w:tcPr>
+            <w:tcW w:type="dxa" w:w="2550"/>
+            <w:tcMar>
+              <w:top w:type="dxa" w:w="60"/>
+              <w:left w:type="dxa" w:w="100"/>
+              <w:bottom w:type="dxa" w:w="60"/>
+              <w:right w:type="dxa" w:w="100"/>
+            </w:tcMar>
+          </w:tcPr>
+          <w:p>
+            <w:pPr>
+              <w:spacing w:after="40" w:before="40" w:line="250"/>
+            </w:pPr>
+            <w:r>
+              <w:rPr>
+                <w:rFonts w:ascii="Calibri" w:cs="Calibri" w:eastAsia="Calibri" w:hAnsi="Calibri"/>
+                <w:b w:val="false"/>
+                <w:bCs w:val="false"/>
+                <w:color w:val="000000"/>
+                <w:sz w:val="18"/>
+                <w:szCs w:val="18"/>
+              </w:rPr>
+              <w:t xml:space="preserve">CONTRATADA</w:t>
+            </w:r>
+          </w:p>
+        </w:tc>
+        <w:tc>
+          <w:tcPr>
+            <w:tcW w:type="dxa" w:w="3406"/>
+            <w:tcMar>
+              <w:top w:type="dxa" w:w="60"/>
+              <w:left w:type="dxa" w:w="100"/>
+              <w:bottom w:type="dxa" w:w="60"/>
+              <w:right w:type="dxa" w:w="100"/>
+            </w:tcMar>
+          </w:tcPr>
+          <w:p>
+            <w:pPr>
+              <w:spacing w:after="40" w:before="40" w:line="250"/>
+            </w:pPr>
+            <w:r>
+              <w:rPr>
+                <w:rFonts w:ascii="Calibri" w:cs="Calibri" w:eastAsia="Calibri" w:hAnsi="Calibri"/>
+                <w:b w:val="false"/>
+                <w:bCs w:val="false"/>
+                <w:color w:val="000000"/>
+                <w:sz w:val="18"/>
+                <w:szCs w:val="18"/>
+              </w:rPr>
+              <w:t xml:space="preserve">Responde pelos atos deles (item 5 deste Anexo).</w:t>
+            </w:r>
+          </w:p>
+        </w:tc>
+      </w:tr>
+      <w:tr>
+        <w:trPr>
+          <w:cantSplit/>
+          <w:tblHeader w:val="false"/>
+        </w:trPr>
+        <w:tc>
+          <w:tcPr>
+            <w:tcW w:type="dxa" w:w="3150"/>
+            <w:tcMar>
+              <w:top w:type="dxa" w:w="60"/>
+              <w:left w:type="dxa" w:w="100"/>
+              <w:bottom w:type="dxa" w:w="60"/>
+              <w:right w:type="dxa" w:w="100"/>
+            </w:tcMar>
+          </w:tcPr>
+          <w:p>
+            <w:pPr>
+              <w:spacing w:after="40" w:before="40" w:line="250"/>
+            </w:pPr>
+            <w:r>
+              <w:rPr>
+                <w:rFonts w:ascii="Calibri" w:cs="Calibri" w:eastAsia="Calibri" w:hAnsi="Calibri"/>
+                <w:b w:val="false"/>
+                <w:bCs w:val="false"/>
+                <w:color w:val="000000"/>
+                <w:sz w:val="18"/>
+                <w:szCs w:val="18"/>
+              </w:rPr>
+              <w:t xml:space="preserve">Atendimento operacional a requisições de titulares</w:t>
+            </w:r>
+          </w:p>
+        </w:tc>
+        <w:tc>
+          <w:tcPr>
+            <w:tcW w:type="dxa" w:w="2550"/>
+            <w:tcMar>
+              <w:top w:type="dxa" w:w="60"/>
+              <w:left w:type="dxa" w:w="100"/>
+              <w:bottom w:type="dxa" w:w="60"/>
+              <w:right w:type="dxa" w:w="100"/>
+            </w:tcMar>
+          </w:tcPr>
+          <w:p>
+            <w:pPr>
+              <w:spacing w:after="40" w:before="40" w:line="250"/>
+            </w:pPr>
+            <w:r>
+              <w:rPr>
+                <w:rFonts w:ascii="Calibri" w:cs="Calibri" w:eastAsia="Calibri" w:hAnsi="Calibri"/>
+                <w:b w:val="false"/>
+                <w:bCs w:val="false"/>
+                <w:color w:val="000000"/>
+                <w:sz w:val="18"/>
+                <w:szCs w:val="18"/>
+              </w:rPr>
+              <w:t xml:space="preserve">CONTRATADA</w:t>
+            </w:r>
+          </w:p>
+        </w:tc>
+        <w:tc>
+          <w:tcPr>
+            <w:tcW w:type="dxa" w:w="3406"/>
+            <w:tcMar>
+              <w:top w:type="dxa" w:w="60"/>
+              <w:left w:type="dxa" w:w="100"/>
+              <w:bottom w:type="dxa" w:w="60"/>
+              <w:right w:type="dxa" w:w="100"/>
+            </w:tcMar>
+          </w:tcPr>
+          <w:p>
+            <w:pPr>
+              <w:spacing w:after="40" w:before="40" w:line="250"/>
+            </w:pPr>
+            <w:r>
+              <w:rPr>
+                <w:rFonts w:ascii="Calibri" w:cs="Calibri" w:eastAsia="Calibri" w:hAnsi="Calibri"/>
+                <w:b w:val="false"/>
+                <w:bCs w:val="false"/>
+                <w:color w:val="000000"/>
+                <w:sz w:val="18"/>
+                <w:szCs w:val="18"/>
+              </w:rPr>
+              <w:t xml:space="preserve">A resposta formal ao titular cabe à CONTRATANTE.</w:t>
+            </w:r>
+          </w:p>
+        </w:tc>
+      </w:tr>
+      <w:tr>
+        <w:trPr>
+          <w:cantSplit/>
+          <w:tblHeader w:val="false"/>
+        </w:trPr>
+        <w:tc>
+          <w:tcPr>
+            <w:tcW w:type="dxa" w:w="3150"/>
+            <w:tcMar>
+              <w:top w:type="dxa" w:w="60"/>
+              <w:left w:type="dxa" w:w="100"/>
+              <w:bottom w:type="dxa" w:w="60"/>
+              <w:right w:type="dxa" w:w="100"/>
+            </w:tcMar>
+          </w:tcPr>
+          <w:p>
+            <w:pPr>
+              <w:spacing w:after="40" w:before="40" w:line="250"/>
+            </w:pPr>
+            <w:r>
+              <w:rPr>
+                <w:rFonts w:ascii="Calibri" w:cs="Calibri" w:eastAsia="Calibri" w:hAnsi="Calibri"/>
+                <w:b w:val="false"/>
+                <w:bCs w:val="false"/>
+                <w:color w:val="000000"/>
+                <w:sz w:val="18"/>
+                <w:szCs w:val="18"/>
+              </w:rPr>
+              <w:t xml:space="preserve">Execução técnica da eliminação e do expurgo</w:t>
+            </w:r>
+          </w:p>
+        </w:tc>
+        <w:tc>
+          <w:tcPr>
+            <w:tcW w:type="dxa" w:w="2550"/>
+            <w:tcMar>
+              <w:top w:type="dxa" w:w="60"/>
+              <w:left w:type="dxa" w:w="100"/>
+              <w:bottom w:type="dxa" w:w="60"/>
+              <w:right w:type="dxa" w:w="100"/>
+            </w:tcMar>
+          </w:tcPr>
+          <w:p>
+            <w:pPr>
+              <w:spacing w:after="40" w:before="40" w:line="250"/>
+            </w:pPr>
+            <w:r>
+              <w:rPr>
+                <w:rFonts w:ascii="Calibri" w:cs="Calibri" w:eastAsia="Calibri" w:hAnsi="Calibri"/>
+                <w:b w:val="false"/>
+                <w:bCs w:val="false"/>
+                <w:color w:val="000000"/>
+                <w:sz w:val="18"/>
+                <w:szCs w:val="18"/>
+              </w:rPr>
+              <w:t xml:space="preserve">CONTRATADA</w:t>
+            </w:r>
+          </w:p>
+        </w:tc>
+        <w:tc>
+          <w:tcPr>
+            <w:tcW w:type="dxa" w:w="3406"/>
+            <w:tcMar>
+              <w:top w:type="dxa" w:w="60"/>
+              <w:left w:type="dxa" w:w="100"/>
+              <w:bottom w:type="dxa" w:w="60"/>
+              <w:right w:type="dxa" w:w="100"/>
+            </w:tcMar>
+          </w:tcPr>
+          <w:p>
+            <w:pPr>
+              <w:spacing w:after="40" w:before="40" w:line="250"/>
+            </w:pPr>
+            <w:r>
+              <w:rPr>
+                <w:rFonts w:ascii="Calibri" w:cs="Calibri" w:eastAsia="Calibri" w:hAnsi="Calibri"/>
+                <w:b w:val="false"/>
+                <w:bCs w:val="false"/>
+                <w:color w:val="000000"/>
+                <w:sz w:val="18"/>
+                <w:szCs w:val="18"/>
+              </w:rPr>
+              <w:t xml:space="preserve">Nos prazos do item 6.4 deste Anexo.</w:t>
+            </w:r>
+          </w:p>
+        </w:tc>
+      </w:tr>
+      <w:tr>
+        <w:trPr>
+          <w:cantSplit/>
+          <w:tblHeader w:val="false"/>
+        </w:trPr>
+        <w:tc>
+          <w:tcPr>
+            <w:tcW w:type="dxa" w:w="3150"/>
+            <w:tcMar>
+              <w:top w:type="dxa" w:w="60"/>
+              <w:left w:type="dxa" w:w="100"/>
+              <w:bottom w:type="dxa" w:w="60"/>
+              <w:right w:type="dxa" w:w="100"/>
+            </w:tcMar>
+          </w:tcPr>
+          <w:p>
+            <w:pPr>
+              <w:spacing w:after="40" w:before="40" w:line="250"/>
+            </w:pPr>
+            <w:r>
+              <w:rPr>
+                <w:rFonts w:ascii="Calibri" w:cs="Calibri" w:eastAsia="Calibri" w:hAnsi="Calibri"/>
+                <w:b w:val="false"/>
+                <w:bCs w:val="false"/>
+                <w:color w:val="000000"/>
+                <w:sz w:val="18"/>
+                <w:szCs w:val="18"/>
+              </w:rPr>
+              <w:t xml:space="preserve">Comunicação de incidente à ANPD e aos titulares</w:t>
+            </w:r>
+          </w:p>
+        </w:tc>
+        <w:tc>
+          <w:tcPr>
+            <w:tcW w:type="dxa" w:w="2550"/>
+            <w:tcMar>
+              <w:top w:type="dxa" w:w="60"/>
+              <w:left w:type="dxa" w:w="100"/>
+              <w:bottom w:type="dxa" w:w="60"/>
+              <w:right w:type="dxa" w:w="100"/>
+            </w:tcMar>
+          </w:tcPr>
+          <w:p>
+            <w:pPr>
+              <w:spacing w:after="40" w:before="40" w:line="250"/>
+            </w:pPr>
+            <w:r>
+              <w:rPr>
+                <w:rFonts w:ascii="Calibri" w:cs="Calibri" w:eastAsia="Calibri" w:hAnsi="Calibri"/>
+                <w:b w:val="false"/>
+                <w:bCs w:val="false"/>
+                <w:color w:val="000000"/>
+                <w:sz w:val="18"/>
+                <w:szCs w:val="18"/>
+              </w:rPr>
+              <w:t xml:space="preserve">CONTRATANTE</w:t>
+            </w:r>
+          </w:p>
+        </w:tc>
+        <w:tc>
+          <w:tcPr>
+            <w:tcW w:type="dxa" w:w="3406"/>
+            <w:tcMar>
+              <w:top w:type="dxa" w:w="60"/>
+              <w:left w:type="dxa" w:w="100"/>
+              <w:bottom w:type="dxa" w:w="60"/>
+              <w:right w:type="dxa" w:w="100"/>
+            </w:tcMar>
+          </w:tcPr>
+          <w:p>
+            <w:pPr>
+              <w:spacing w:after="40" w:before="40" w:line="250"/>
+            </w:pPr>
+            <w:r>
+              <w:rPr>
+                <w:rFonts w:ascii="Calibri" w:cs="Calibri" w:eastAsia="Calibri" w:hAnsi="Calibri"/>
+                <w:b w:val="false"/>
+                <w:bCs w:val="false"/>
+                <w:color w:val="000000"/>
+                <w:sz w:val="18"/>
+                <w:szCs w:val="18"/>
+              </w:rPr>
+              <w:t xml:space="preserve">A CONTRATADA comunica o incidente à CONTRATANTE.</w:t>
+            </w:r>
+          </w:p>
+        </w:tc>
+      </w:tr>
+    </w:tbl>
+    <w:p>
+      <w:pPr>
+        <w:keepNext/>
+        <w:spacing w:after="90" w:before="200" w:line="276"/>
+      </w:pPr>
+      <w:r>
+        <w:rPr>
+          <w:rFonts w:ascii="Calibri" w:cs="Calibri" w:eastAsia="Calibri" w:hAnsi="Calibri"/>
+          <w:b/>
+          <w:bCs/>
+          <w:color w:val="083F5E"/>
+          <w:sz w:val="21"/>
+          <w:szCs w:val="21"/>
+        </w:rPr>
+        <w:t xml:space="preserve">2. MEDIÇÃO DA DISPONIBILIDADE</w:t>
+      </w:r>
+    </w:p>
+    <w:p>
+      <w:pPr>
+        <w:spacing w:after="88" w:line="272"/>
+        <w:ind w:left="300"/>
+        <w:jc w:val="both"/>
+      </w:pPr>
+      <w:r>
+        <w:rPr>
+          <w:rFonts w:ascii="Calibri" w:cs="Calibri" w:eastAsia="Calibri" w:hAnsi="Calibri"/>
+          <w:sz w:val="22"/>
+          <w:szCs w:val="22"/>
+        </w:rPr>
+        <w:t xml:space="preserve">2.1. A disponibilidade mensal é apurada como a razão entre os minutos em que o sistema esteve acessível e o total de minutos do mês civil, com base nos </w:t>
+      </w:r>
+      <w:r>
+        <w:rPr>
+          <w:rFonts w:ascii="Calibri" w:cs="Calibri" w:eastAsia="Calibri" w:hAnsi="Calibri"/>
+          <w:b/>
+          <w:bCs/>
+          <w:sz w:val="22"/>
+          <w:szCs w:val="22"/>
+        </w:rPr>
+        <w:t xml:space="preserve">registros de monitoramento e nos logs de servidor da CONTRATADA</w:t>
+      </w:r>
+      <w:r>
+        <w:rPr>
+          <w:rFonts w:ascii="Calibri" w:cs="Calibri" w:eastAsia="Calibri" w:hAnsi="Calibri"/>
+          <w:sz w:val="22"/>
+          <w:szCs w:val="22"/>
+        </w:rPr>
+        <w:t xml:space="preserve">, que serão disponibilizados à CONTRATANTE mediante solicitação.</w:t>
+      </w:r>
+    </w:p>
+    <w:p>
+      <w:pPr>
+        <w:spacing w:after="88" w:line="272"/>
+        <w:ind w:left="300"/>
+        <w:jc w:val="both"/>
+      </w:pPr>
+      <w:r>
+        <w:rPr>
+          <w:rFonts w:ascii="Calibri" w:cs="Calibri" w:eastAsia="Calibri" w:hAnsi="Calibri"/>
+          <w:sz w:val="22"/>
+          <w:szCs w:val="22"/>
+        </w:rPr>
+        <w:t xml:space="preserve">2.2. Não são computados como indisponibilidade os eventos excluídos pelos itens 4.2 e 4.2.1 do contrato. Considera-se indisponível o sistema quando </w:t>
+      </w:r>
+      <w:r>
+        <w:rPr>
+          <w:rFonts w:ascii="Calibri" w:cs="Calibri" w:eastAsia="Calibri" w:hAnsi="Calibri"/>
+          <w:b/>
+          <w:bCs/>
+          <w:sz w:val="22"/>
+          <w:szCs w:val="22"/>
+        </w:rPr>
+        <w:t xml:space="preserve">o módulo de controle de acesso</w:t>
+      </w:r>
+      <w:r>
+        <w:rPr>
+          <w:rFonts w:ascii="Calibri" w:cs="Calibri" w:eastAsia="Calibri" w:hAnsi="Calibri"/>
+          <w:sz w:val="22"/>
+          <w:szCs w:val="22"/>
+        </w:rPr>
+        <w:t xml:space="preserve"> não permitir o registro de entradas e saídas, ainda que os demais módulos operem.</w:t>
+      </w:r>
+    </w:p>
+    <w:p>
+      <w:pPr>
+        <w:spacing w:after="88" w:line="272"/>
+        <w:ind w:left="300"/>
+        <w:jc w:val="both"/>
+      </w:pPr>
+      <w:r>
+        <w:rPr>
+          <w:rFonts w:ascii="Calibri" w:cs="Calibri" w:eastAsia="Calibri" w:hAnsi="Calibri"/>
+          <w:sz w:val="22"/>
+          <w:szCs w:val="22"/>
+        </w:rPr>
+        <w:t xml:space="preserve">2.3. A CONTRATANTE poderá contestar a medição em até 30 (trinta) dias do fechamento do mês, apresentando os registros em que se baseia; havendo divergência, prevalecerão os registros de monitoramento, salvo prova em contrário.</w:t>
+      </w:r>
+    </w:p>
+    <w:p>
+      <w:pPr>
+        <w:keepNext/>
+        <w:spacing w:after="90" w:before="200" w:line="276"/>
+      </w:pPr>
+      <w:r>
+        <w:rPr>
+          <w:rFonts w:ascii="Calibri" w:cs="Calibri" w:eastAsia="Calibri" w:hAnsi="Calibri"/>
+          <w:b/>
+          <w:bCs/>
+          <w:color w:val="083F5E"/>
+          <w:sz w:val="21"/>
+          <w:szCs w:val="21"/>
+        </w:rPr>
+        <w:t xml:space="preserve">3. PROCEDIMENTO DE CHAMADOS</w:t>
+      </w:r>
+    </w:p>
+    <w:p>
+      <w:pPr>
+        <w:spacing w:after="88" w:line="272"/>
+        <w:ind w:left="300"/>
+        <w:jc w:val="both"/>
+      </w:pPr>
+      <w:r>
+        <w:rPr>
+          <w:rFonts w:ascii="Calibri" w:cs="Calibri" w:eastAsia="Calibri" w:hAnsi="Calibri"/>
+          <w:sz w:val="22"/>
+          <w:szCs w:val="22"/>
+        </w:rPr>
+        <w:t xml:space="preserve">3.1. Os chamados são abertos pelos canais oficiais informados à CONTRATANTE (telefone, WhatsApp corporativo e e-mail), informando: condomínio, pessoa solicitante, módulo afetado, descrição do problema e, quando possível, print da tela.</w:t>
+      </w:r>
+    </w:p>
+    <w:p>
+      <w:pPr>
+        <w:spacing w:after="88" w:line="272"/>
+        <w:ind w:left="300"/>
+        <w:jc w:val="both"/>
+      </w:pPr>
+      <w:r>
+        <w:rPr>
+          <w:rFonts w:ascii="Calibri" w:cs="Calibri" w:eastAsia="Calibri" w:hAnsi="Calibri"/>
+          <w:sz w:val="22"/>
+          <w:szCs w:val="22"/>
+        </w:rPr>
+        <w:t xml:space="preserve">3.2. A classificação de gravidade (crítico, alto ou normal) segue o item 4.3 do contrato e é atribuída pela CONTRATADA na abertura, podendo ser reclassificada mediante justificativa comunicada à CONTRATANTE.</w:t>
+      </w:r>
+    </w:p>
+    <w:p>
+      <w:pPr>
+        <w:spacing w:after="88" w:line="272"/>
+        <w:ind w:left="300"/>
+        <w:jc w:val="both"/>
+      </w:pPr>
+      <w:r>
+        <w:rPr>
+          <w:rFonts w:ascii="Calibri" w:cs="Calibri" w:eastAsia="Calibri" w:hAnsi="Calibri"/>
+          <w:sz w:val="22"/>
+          <w:szCs w:val="22"/>
+        </w:rPr>
+        <w:t xml:space="preserve">3.3. Cada chamado recebe número de protocolo e registro de data e hora de abertura, primeira resposta e encerramento.</w:t>
+      </w:r>
+    </w:p>
+    <w:p>
+      <w:pPr>
+        <w:keepNext/>
+        <w:spacing w:after="90" w:before="200" w:line="276"/>
+      </w:pPr>
+      <w:r>
+        <w:rPr>
+          <w:rFonts w:ascii="Calibri" w:cs="Calibri" w:eastAsia="Calibri" w:hAnsi="Calibri"/>
+          <w:b/>
+          <w:bCs/>
+          <w:color w:val="083F5E"/>
+          <w:sz w:val="21"/>
+          <w:szCs w:val="21"/>
+        </w:rPr>
+        <w:t xml:space="preserve">4. SEGURANÇA DA INFORMAÇÃO</w:t>
+      </w:r>
+    </w:p>
+    <w:p>
+      <w:pPr>
+        <w:spacing w:after="88" w:line="272"/>
+        <w:ind w:left="300"/>
+        <w:jc w:val="both"/>
+      </w:pPr>
+      <w:r>
+        <w:rPr>
+          <w:rFonts w:ascii="Calibri" w:cs="Calibri" w:eastAsia="Calibri" w:hAnsi="Calibri"/>
+          <w:sz w:val="22"/>
+          <w:szCs w:val="22"/>
+        </w:rPr>
+        <w:t xml:space="preserve">4.1. A CONTRATADA adota, no mínimo: criptografia em trânsito (TLS) e em repouso para dados sensíveis; autenticação por credenciais individuais; registro (log) de acessos administrativos, com retenção mínima de 6 (seis) meses; segregação lógica dos dados entre condomínios; cópia de segurança diária com teste periódico de restauração; e controle de acesso restrito de sua equipe ao estritamente necessário.</w:t>
+      </w:r>
+    </w:p>
+    <w:p>
+      <w:pPr>
+        <w:spacing w:after="88" w:line="272"/>
+        <w:ind w:left="300"/>
+        <w:jc w:val="both"/>
+      </w:pPr>
+      <w:r>
+        <w:rPr>
+          <w:rFonts w:ascii="Calibri" w:cs="Calibri" w:eastAsia="Calibri" w:hAnsi="Calibri"/>
+          <w:sz w:val="22"/>
+          <w:szCs w:val="22"/>
+        </w:rPr>
+        <w:t xml:space="preserve">4.2. </w:t>
+      </w:r>
+      <w:r>
+        <w:rPr>
+          <w:rFonts w:ascii="Calibri" w:cs="Calibri" w:eastAsia="Calibri" w:hAnsi="Calibri"/>
+          <w:b/>
+          <w:bCs/>
+          <w:sz w:val="22"/>
+          <w:szCs w:val="22"/>
+        </w:rPr>
+        <w:t xml:space="preserve">Biometria — detalhamento.</w:t>
+      </w:r>
+      <w:r>
+        <w:rPr>
+          <w:rFonts w:ascii="Calibri" w:cs="Calibri" w:eastAsia="Calibri" w:hAnsi="Calibri"/>
+          <w:sz w:val="22"/>
+          <w:szCs w:val="22"/>
+        </w:rPr>
+        <w:t xml:space="preserve"> Os templates biométricos são armazenados de forma criptografada, em base segregada, acessível apenas aos processos de identificação; não são exportados nem utilizados para qualquer outra finalidade. A revogação do consentimento ou a oposição do titular é registrada e processada com exclusão do template das bases de produção em até 30 (trinta) dias e das cópias de segurança no ciclo técnico subsequente, que não excederá 90 (noventa) dias. Eventual transferência internacional observará os arts. 33 a 36 da LGPD e será previamente informada à CONTRATANTE.</w:t>
+      </w:r>
+    </w:p>
+    <w:p>
+      <w:pPr>
+        <w:keepNext/>
+        <w:spacing w:after="90" w:before="200" w:line="276"/>
+      </w:pPr>
+      <w:r>
+        <w:rPr>
+          <w:rFonts w:ascii="Calibri" w:cs="Calibri" w:eastAsia="Calibri" w:hAnsi="Calibri"/>
+          <w:b/>
+          <w:bCs/>
+          <w:color w:val="083F5E"/>
+          <w:sz w:val="21"/>
+          <w:szCs w:val="21"/>
+        </w:rPr>
+        <w:t xml:space="preserve">5. SUBOPERADORES</w:t>
+      </w:r>
+    </w:p>
+    <w:p>
+      <w:pPr>
+        <w:spacing w:after="88" w:line="272"/>
+        <w:ind w:left="300"/>
+        <w:jc w:val="both"/>
+      </w:pPr>
+      <w:r>
+        <w:rPr>
+          <w:rFonts w:ascii="Calibri" w:cs="Calibri" w:eastAsia="Calibri" w:hAnsi="Calibri"/>
+          <w:sz w:val="22"/>
+          <w:szCs w:val="22"/>
+        </w:rPr>
+        <w:t xml:space="preserve">5.1. A CONTRATADA utiliza suboperadores nas seguintes categorias: </w:t>
+      </w:r>
+      <w:r>
+        <w:rPr>
+          <w:rFonts w:ascii="Calibri" w:cs="Calibri" w:eastAsia="Calibri" w:hAnsi="Calibri"/>
+          <w:b/>
+          <w:bCs/>
+          <w:sz w:val="22"/>
+          <w:szCs w:val="22"/>
+        </w:rPr>
+        <w:t xml:space="preserve">hospedagem e infraestrutura em nuvem</w:t>
+      </w:r>
+      <w:r>
+        <w:rPr>
+          <w:rFonts w:ascii="Calibri" w:cs="Calibri" w:eastAsia="Calibri" w:hAnsi="Calibri"/>
+          <w:sz w:val="22"/>
+          <w:szCs w:val="22"/>
+        </w:rPr>
+        <w:t xml:space="preserve">; </w:t>
+      </w:r>
+      <w:r>
+        <w:rPr>
+          <w:rFonts w:ascii="Calibri" w:cs="Calibri" w:eastAsia="Calibri" w:hAnsi="Calibri"/>
+          <w:b/>
+          <w:bCs/>
+          <w:sz w:val="22"/>
+          <w:szCs w:val="22"/>
+        </w:rPr>
+        <w:t xml:space="preserve">sistema financeiro e emissão de cobrança</w:t>
+      </w:r>
+      <w:r>
+        <w:rPr>
+          <w:rFonts w:ascii="Calibri" w:cs="Calibri" w:eastAsia="Calibri" w:hAnsi="Calibri"/>
+          <w:sz w:val="22"/>
+          <w:szCs w:val="22"/>
+        </w:rPr>
+        <w:t xml:space="preserve">; </w:t>
+      </w:r>
+      <w:r>
+        <w:rPr>
+          <w:rFonts w:ascii="Calibri" w:cs="Calibri" w:eastAsia="Calibri" w:hAnsi="Calibri"/>
+          <w:b/>
+          <w:bCs/>
+          <w:sz w:val="22"/>
+          <w:szCs w:val="22"/>
+        </w:rPr>
+        <w:t xml:space="preserve">serviços de comunicação e notificação</w:t>
+      </w:r>
+      <w:r>
+        <w:rPr>
+          <w:rFonts w:ascii="Calibri" w:cs="Calibri" w:eastAsia="Calibri" w:hAnsi="Calibri"/>
+          <w:sz w:val="22"/>
+          <w:szCs w:val="22"/>
+        </w:rPr>
+        <w:t xml:space="preserve"> (mensageria, e-mail e push). A relação nominal atualizada é fornecida à CONTRATANTE mediante solicitação.</w:t>
+      </w:r>
+    </w:p>
+    <w:p>
+      <w:pPr>
+        <w:spacing w:after="88" w:line="272"/>
+        <w:ind w:left="300"/>
+        <w:jc w:val="both"/>
+      </w:pPr>
+      <w:r>
+        <w:rPr>
+          <w:rFonts w:ascii="Calibri" w:cs="Calibri" w:eastAsia="Calibri" w:hAnsi="Calibri"/>
+          <w:sz w:val="22"/>
+          <w:szCs w:val="22"/>
+        </w:rPr>
+        <w:t xml:space="preserve">5.2. A CONTRATADA exige de cada suboperador nível de proteção equivalente ao deste contrato, responde por seus atos perante a CONTRATANTE e informa previamente alterações relevantes na relação.</w:t>
+      </w:r>
+    </w:p>
+    <w:p>
+      <w:pPr>
+        <w:keepNext/>
+        <w:spacing w:after="90" w:before="200" w:line="276"/>
+      </w:pPr>
+      <w:r>
+        <w:rPr>
+          <w:rFonts w:ascii="Calibri" w:cs="Calibri" w:eastAsia="Calibri" w:hAnsi="Calibri"/>
+          <w:b/>
+          <w:bCs/>
+          <w:color w:val="083F5E"/>
+          <w:sz w:val="21"/>
+          <w:szCs w:val="21"/>
+        </w:rPr>
+        <w:t xml:space="preserve">6. EXPORTAÇÃO E ELIMINAÇÃO DE DADOS</w:t>
+      </w:r>
+    </w:p>
+    <w:p>
+      <w:pPr>
+        <w:spacing w:after="88" w:line="272"/>
+        <w:ind w:left="300"/>
+        <w:jc w:val="both"/>
+      </w:pPr>
+      <w:r>
+        <w:rPr>
+          <w:rFonts w:ascii="Calibri" w:cs="Calibri" w:eastAsia="Calibri" w:hAnsi="Calibri"/>
+          <w:sz w:val="22"/>
+          <w:szCs w:val="22"/>
+        </w:rPr>
+        <w:t xml:space="preserve">6.1. </w:t>
+      </w:r>
+      <w:r>
+        <w:rPr>
+          <w:rFonts w:ascii="Calibri" w:cs="Calibri" w:eastAsia="Calibri" w:hAnsi="Calibri"/>
+          <w:b/>
+          <w:bCs/>
+          <w:sz w:val="22"/>
+          <w:szCs w:val="22"/>
+        </w:rPr>
+        <w:t xml:space="preserve">Conteúdo da exportação.</w:t>
+      </w:r>
+      <w:r>
+        <w:rPr>
+          <w:rFonts w:ascii="Calibri" w:cs="Calibri" w:eastAsia="Calibri" w:hAnsi="Calibri"/>
+          <w:sz w:val="22"/>
+          <w:szCs w:val="22"/>
+        </w:rPr>
+        <w:t xml:space="preserve"> A exportação prevista no item 7.8 do contrato abrange: cadastros de unidades, moradores, funcionários, veículos e prestadores; registros de acesso (entradas e saídas, com data, hora e autorizante); encomendas; ocorrências; reservas de áreas comuns; comunicados; lançamentos financeiros e histórico de cobrança; e os documentos e anexos carregados pela CONTRATANTE.</w:t>
+      </w:r>
+    </w:p>
+    <w:p>
+      <w:pPr>
+        <w:spacing w:after="88" w:line="272"/>
+        <w:ind w:left="300"/>
+        <w:jc w:val="both"/>
+      </w:pPr>
+      <w:r>
+        <w:rPr>
+          <w:rFonts w:ascii="Calibri" w:cs="Calibri" w:eastAsia="Calibri" w:hAnsi="Calibri"/>
+          <w:sz w:val="22"/>
+          <w:szCs w:val="22"/>
+        </w:rPr>
+        <w:t xml:space="preserve">6.2. </w:t>
+      </w:r>
+      <w:r>
+        <w:rPr>
+          <w:rFonts w:ascii="Calibri" w:cs="Calibri" w:eastAsia="Calibri" w:hAnsi="Calibri"/>
+          <w:b/>
+          <w:bCs/>
+          <w:sz w:val="22"/>
+          <w:szCs w:val="22"/>
+        </w:rPr>
+        <w:t xml:space="preserve">Formatos.</w:t>
+      </w:r>
+      <w:r>
+        <w:rPr>
+          <w:rFonts w:ascii="Calibri" w:cs="Calibri" w:eastAsia="Calibri" w:hAnsi="Calibri"/>
+          <w:sz w:val="22"/>
+          <w:szCs w:val="22"/>
+        </w:rPr>
+        <w:t xml:space="preserve"> Dados tabulares em CSV ou Excel, com cabeçalho identificando cada campo; relatórios em PDF; documentos e anexos em seus formatos originais, organizados por pasta. Mediante solicitação, a CONTRATADA presta </w:t>
+      </w:r>
+      <w:r>
+        <w:rPr>
+          <w:rFonts w:ascii="Calibri" w:cs="Calibri" w:eastAsia="Calibri" w:hAnsi="Calibri"/>
+          <w:b/>
+          <w:bCs/>
+          <w:sz w:val="22"/>
+          <w:szCs w:val="22"/>
+        </w:rPr>
+        <w:t xml:space="preserve">exportação assistida</w:t>
+      </w:r>
+      <w:r>
+        <w:rPr>
+          <w:rFonts w:ascii="Calibri" w:cs="Calibri" w:eastAsia="Calibri" w:hAnsi="Calibri"/>
+          <w:sz w:val="22"/>
+          <w:szCs w:val="22"/>
+        </w:rPr>
+        <w:t xml:space="preserve">, orientando a CONTRATANTE na geração e na conferência dos arquivos.</w:t>
+      </w:r>
+    </w:p>
+    <w:p>
+      <w:pPr>
+        <w:spacing w:after="88" w:line="272"/>
+        <w:ind w:left="300"/>
+        <w:jc w:val="both"/>
+      </w:pPr>
+      <w:r>
+        <w:rPr>
+          <w:rFonts w:ascii="Calibri" w:cs="Calibri" w:eastAsia="Calibri" w:hAnsi="Calibri"/>
+          <w:sz w:val="22"/>
+          <w:szCs w:val="22"/>
+        </w:rPr>
+        <w:t xml:space="preserve">6.3. </w:t>
+      </w:r>
+      <w:r>
+        <w:rPr>
+          <w:rFonts w:ascii="Calibri" w:cs="Calibri" w:eastAsia="Calibri" w:hAnsi="Calibri"/>
+          <w:b/>
+          <w:bCs/>
+          <w:sz w:val="22"/>
+          <w:szCs w:val="22"/>
+        </w:rPr>
+        <w:t xml:space="preserve">Logs e auditoria.</w:t>
+      </w:r>
+      <w:r>
+        <w:rPr>
+          <w:rFonts w:ascii="Calibri" w:cs="Calibri" w:eastAsia="Calibri" w:hAnsi="Calibri"/>
+          <w:sz w:val="22"/>
+          <w:szCs w:val="22"/>
+        </w:rPr>
+        <w:t xml:space="preserve"> Os registros de auditoria (logs de acesso administrativo) são fornecidos em CSV quando solicitados por escrito, no mesmo prazo do item 7.8.</w:t>
+      </w:r>
+    </w:p>
+    <w:p>
+      <w:pPr>
+        <w:spacing w:after="88" w:line="272"/>
+        <w:ind w:left="300"/>
+        <w:jc w:val="both"/>
+      </w:pPr>
+      <w:r>
+        <w:rPr>
+          <w:rFonts w:ascii="Calibri" w:cs="Calibri" w:eastAsia="Calibri" w:hAnsi="Calibri"/>
+          <w:sz w:val="22"/>
+          <w:szCs w:val="22"/>
+        </w:rPr>
+        <w:t xml:space="preserve">6.4. </w:t>
+      </w:r>
+      <w:r>
+        <w:rPr>
+          <w:rFonts w:ascii="Calibri" w:cs="Calibri" w:eastAsia="Calibri" w:hAnsi="Calibri"/>
+          <w:b/>
+          <w:bCs/>
+          <w:sz w:val="22"/>
+          <w:szCs w:val="22"/>
+        </w:rPr>
+        <w:t xml:space="preserve">Eliminação.</w:t>
+      </w:r>
+      <w:r>
+        <w:rPr>
+          <w:rFonts w:ascii="Calibri" w:cs="Calibri" w:eastAsia="Calibri" w:hAnsi="Calibri"/>
+          <w:sz w:val="22"/>
+          <w:szCs w:val="22"/>
+        </w:rPr>
+        <w:t xml:space="preserve"> Concluído o prazo de resgate, os dados pessoais são eliminados </w:t>
+      </w:r>
+      <w:r>
+        <w:rPr>
+          <w:rFonts w:ascii="Calibri" w:cs="Calibri" w:eastAsia="Calibri" w:hAnsi="Calibri"/>
+          <w:b/>
+          <w:bCs/>
+          <w:sz w:val="22"/>
+          <w:szCs w:val="22"/>
+        </w:rPr>
+        <w:t xml:space="preserve">das bases de produção em até 30 (trinta) dias e das cópias de segurança no ciclo técnico subsequente, que não excederá 90 (noventa) dias</w:t>
+      </w:r>
+      <w:r>
+        <w:rPr>
+          <w:rFonts w:ascii="Calibri" w:cs="Calibri" w:eastAsia="Calibri" w:hAnsi="Calibri"/>
+          <w:sz w:val="22"/>
+          <w:szCs w:val="22"/>
+        </w:rPr>
+        <w:t xml:space="preserve"> — regra única aplicável a todo este contrato, inclusive aos dados biométricos. Ficam ressalvados os dados de </w:t>
+      </w:r>
+      <w:r>
+        <w:rPr>
+          <w:rFonts w:ascii="Calibri" w:cs="Calibri" w:eastAsia="Calibri" w:hAnsi="Calibri"/>
+          <w:b/>
+          <w:bCs/>
+          <w:sz w:val="22"/>
+          <w:szCs w:val="22"/>
+        </w:rPr>
+        <w:t xml:space="preserve">retenção legal obrigatória</w:t>
+      </w:r>
+      <w:r>
+        <w:rPr>
+          <w:rFonts w:ascii="Calibri" w:cs="Calibri" w:eastAsia="Calibri" w:hAnsi="Calibri"/>
+          <w:sz w:val="22"/>
+          <w:szCs w:val="22"/>
+        </w:rPr>
+        <w:t xml:space="preserve"> e os estritamente necessários à </w:t>
+      </w:r>
+      <w:r>
+        <w:rPr>
+          <w:rFonts w:ascii="Calibri" w:cs="Calibri" w:eastAsia="Calibri" w:hAnsi="Calibri"/>
+          <w:b/>
+          <w:bCs/>
+          <w:sz w:val="22"/>
+          <w:szCs w:val="22"/>
+        </w:rPr>
+        <w:t xml:space="preserve">defesa de direitos</w:t>
+      </w:r>
+      <w:r>
+        <w:rPr>
+          <w:rFonts w:ascii="Calibri" w:cs="Calibri" w:eastAsia="Calibri" w:hAnsi="Calibri"/>
+          <w:sz w:val="22"/>
+          <w:szCs w:val="22"/>
+        </w:rPr>
+        <w:t xml:space="preserve"> em processo administrativo, judicial ou arbitral, que permanecem com acesso restrito e exclusivamente para essa finalidade.</w:t>
+      </w:r>
+    </w:p>
+    <w:p>
+      <w:pPr>
+        <w:spacing w:after="88" w:line="272"/>
+        <w:ind w:left="300"/>
+        <w:jc w:val="both"/>
+      </w:pPr>
+      <w:r>
+        <w:rPr>
+          <w:rFonts w:ascii="Calibri" w:cs="Calibri" w:eastAsia="Calibri" w:hAnsi="Calibri"/>
+          <w:sz w:val="22"/>
+          <w:szCs w:val="22"/>
+        </w:rPr>
+        <w:t xml:space="preserve">6.5. </w:t>
+      </w:r>
+      <w:r>
+        <w:rPr>
+          <w:rFonts w:ascii="Calibri" w:cs="Calibri" w:eastAsia="Calibri" w:hAnsi="Calibri"/>
+          <w:b/>
+          <w:bCs/>
+          <w:sz w:val="22"/>
+          <w:szCs w:val="22"/>
+        </w:rPr>
+        <w:t xml:space="preserve">Certificado de eliminação.</w:t>
+      </w:r>
+      <w:r>
+        <w:rPr>
+          <w:rFonts w:ascii="Calibri" w:cs="Calibri" w:eastAsia="Calibri" w:hAnsi="Calibri"/>
+          <w:sz w:val="22"/>
+          <w:szCs w:val="22"/>
+        </w:rPr>
+        <w:t xml:space="preserve"> Concluída a eliminação, a CONTRATADA emite declaração escrita indicando as bases atingidas, a data e as eventuais ressalvas do item 6.4.</w:t>
+      </w:r>
+    </w:p>
+    <w:p>
+      <w:pPr>
+        <w:keepNext/>
+        <w:spacing w:after="140" w:before="300"/>
+        <w:jc w:val="center"/>
+      </w:pPr>
+      <w:r>
+        <w:rPr>
+          <w:rFonts w:ascii="Calibri" w:cs="Calibri" w:eastAsia="Calibri" w:hAnsi="Calibri"/>
+          <w:i/>
+          <w:iCs/>
+          <w:color w:val="5C6E8C"/>
+          <w:sz w:val="18"/>
+          <w:szCs w:val="18"/>
+        </w:rPr>
+        <w:t xml:space="preserve">As partes rubricam e assinam o presente Anexo II, que integra o contrato para todos os fins.</w:t>
+      </w:r>
+    </w:p>
+    <w:tbl>
+      <w:tblPr>
+        <w:tblW w:type="dxa" w:w="9106"/>
+        <w:tblBorders>
+          <w:top w:val="none"/>
+          <w:left w:val="none"/>
+          <w:bottom w:val="none"/>
+          <w:right w:val="none"/>
+          <w:insideH w:val="none"/>
+          <w:insideV w:val="none"/>
+        </w:tblBorders>
+      </w:tblPr>
+      <w:tblGrid>
+        <w:gridCol w:w="4553"/>
+        <w:gridCol w:w="4553"/>
+      </w:tblGrid>
+      <w:tr>
+        <w:trPr>
+          <w:cantSplit/>
+        </w:trPr>
+        <w:tc>
+          <w:tcPr>
+            <w:tcW w:type="dxa" w:w="4553"/>
+            <w:tcBorders>
+              <w:top w:val="none"/>
+              <w:left w:val="none"/>
+              <w:bottom w:val="none"/>
+              <w:right w:val="none"/>
+            </w:tcBorders>
+            <w:tcMar>
+              <w:right w:type="dxa" w:w="250"/>
+            </w:tcMar>
+          </w:tcPr>
+          <w:p>
+            <w:pPr>
+              <w:pBdr>
+                <w:top w:val="single" w:color="9AA9C4" w:sz="4" w:space="1"/>
+              </w:pBdr>
+              <w:spacing w:after="40"/>
+            </w:pPr>
+            <w:r>
+              <w:rPr>
+                <w:sz w:val="4"/>
+                <w:szCs w:val="4"/>
+              </w:rPr>
+              <w:t xml:space="preserve"> </w:t>
+            </w:r>
+          </w:p>
+          <w:p>
+            <w:pPr>
+              <w:spacing w:after="20"/>
+            </w:pPr>
+            <w:r>
+              <w:rPr>
+                <w:rFonts w:ascii="Calibri" w:cs="Calibri" w:eastAsia="Calibri" w:hAnsi="Calibri"/>
+                <w:b/>
+                <w:bCs/>
+                <w:color w:val="000000"/>
+                <w:sz w:val="19"/>
+                <w:szCs w:val="19"/>
+              </w:rPr>
+              <w:t xml:space="preserve">CONTRATADA</w:t>
+            </w:r>
+          </w:p>
+          <w:p>
+            <w:pPr>
+              <w:spacing w:after="20"/>
+            </w:pPr>
+            <w:r>
+              <w:rPr>
+                <w:rFonts w:ascii="Calibri" w:cs="Calibri" w:eastAsia="Calibri" w:hAnsi="Calibri"/>
+                <w:b w:val="false"/>
+                <w:bCs w:val="false"/>
+                <w:color w:val="5C6E8C"/>
+                <w:sz w:val="18"/>
+                <w:szCs w:val="18"/>
+              </w:rPr>
+              <w:t xml:space="preserve">Prestare Gestão Condominial Inteligente Ltda-ME</w:t>
+            </w:r>
+          </w:p>
+          <w:p>
+            <w:pPr>
+              <w:spacing w:after="20"/>
+            </w:pPr>
+            <w:r>
+              <w:rPr>
+                <w:rFonts w:ascii="Calibri" w:cs="Calibri" w:eastAsia="Calibri" w:hAnsi="Calibri"/>
+                <w:b w:val="false"/>
+                <w:bCs w:val="false"/>
+                <w:color w:val="5C6E8C"/>
+                <w:sz w:val="18"/>
+                <w:szCs w:val="18"/>
+              </w:rPr>
+              <w:t xml:space="preserve"/>
+            </w:r>
+          </w:p>
+        </w:tc>
+        <w:tc>
+          <w:tcPr>
+            <w:tcW w:type="dxa" w:w="4553"/>
+            <w:tcBorders>
+              <w:top w:val="none"/>
+              <w:left w:val="none"/>
+              <w:bottom w:val="none"/>
+              <w:right w:val="none"/>
+            </w:tcBorders>
+            <w:tcMar>
+              <w:left w:type="dxa" w:w="250"/>
+            </w:tcMar>
+          </w:tcPr>
+          <w:p>
+            <w:pPr>
+              <w:pBdr>
+                <w:top w:val="single" w:color="9AA9C4" w:sz="4" w:space="1"/>
+              </w:pBdr>
+              <w:spacing w:after="40"/>
+            </w:pPr>
+            <w:r>
+              <w:rPr>
+                <w:sz w:val="4"/>
+                <w:szCs w:val="4"/>
+              </w:rPr>
+              <w:t xml:space="preserve"> </w:t>
+            </w:r>
+          </w:p>
+          <w:p>
+            <w:pPr>
+              <w:spacing w:after="20"/>
+            </w:pPr>
+            <w:r>
+              <w:rPr>
+                <w:rFonts w:ascii="Calibri" w:cs="Calibri" w:eastAsia="Calibri" w:hAnsi="Calibri"/>
+                <w:b/>
+                <w:bCs/>
+                <w:color w:val="000000"/>
+                <w:sz w:val="19"/>
+                <w:szCs w:val="19"/>
+              </w:rPr>
+              <w:t xml:space="preserve">CONTRATANTE</w:t>
+            </w:r>
+          </w:p>
+          <w:p>
+            <w:pPr>
+              <w:spacing w:after="20"/>
+            </w:pPr>
+            <w:r>
+              <w:rPr>
+                <w:rFonts w:ascii="Calibri" w:cs="Calibri" w:eastAsia="Calibri" w:hAnsi="Calibri"/>
+                <w:b w:val="false"/>
+                <w:bCs w:val="false"/>
+                <w:color w:val="5C6E8C"/>
+                <w:sz w:val="18"/>
+                <w:szCs w:val="18"/>
+              </w:rPr>
+              <w:t xml:space="preserve">Condomínio Edifício Veredas do Sol</w:t>
+            </w:r>
+          </w:p>
+          <w:p>
+            <w:pPr>
+              <w:spacing w:after="20"/>
+            </w:pPr>
+            <w:r>
+              <w:rPr>
+                <w:rFonts w:ascii="Calibri" w:cs="Calibri" w:eastAsia="Calibri" w:hAnsi="Calibri"/>
+                <w:b w:val="false"/>
+                <w:bCs w:val="false"/>
+                <w:color w:val="5C6E8C"/>
+                <w:sz w:val="18"/>
+                <w:szCs w:val="18"/>
+              </w:rPr>
+              <w:t xml:space="preserve">Síndico(a)</w:t>
             </w:r>
           </w:p>
         </w:tc>

</xml_diff>